<commit_message>
Corregido hallazgos en el cfa
</commit_message>
<xml_diff>
--- a/fuentes/CFA1_12410020_DU.docx
+++ b/fuentes/CFA1_12410020_DU.docx
@@ -85,7 +85,7 @@
               </wp:anchor>
             </w:drawing>
           </mc:Choice>
-          <mc:Fallback xmlns:oel="http://schemas.microsoft.com/office/2019/extlst" xmlns:w16du="http://schemas.microsoft.com/office/word/2023/wordml/word16du" xmlns:w16sdtfl="http://schemas.microsoft.com/office/word/2024/wordml/sdtformatlock">
+          <mc:Fallback xmlns:w16sdtfl="http://schemas.microsoft.com/office/word/2024/wordml/sdtformatlock" xmlns:w16du="http://schemas.microsoft.com/office/word/2023/wordml/word16du" xmlns:oel="http://schemas.microsoft.com/office/2019/extlst">
             <w:pict>
               <v:rect w14:anchorId="4E7873B1" id="Rectángulo 3" o:spid="_x0000_s1026" alt="&quot;&quot;" style="position:absolute;margin-left:-54pt;margin-top:31.65pt;width:613.85pt;height:204pt;z-index:-251655168;visibility:visible;mso-wrap-style:square;mso-height-percent:0;mso-wrap-distance-left:9pt;mso-wrap-distance-top:0;mso-wrap-distance-right:9pt;mso-wrap-distance-bottom:0;mso-position-horizontal:absolute;mso-position-horizontal-relative:text;mso-position-vertical:absolute;mso-position-vertical-relative:text;mso-height-percent:0;mso-height-relative:margin;v-text-anchor:middle" o:gfxdata="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" fillcolor="#00314d" stroked="f" strokeweight="1pt"/>
             </w:pict>
@@ -516,7 +516,7 @@
           <w:r>
             <w:fldChar w:fldCharType="separate"/>
           </w:r>
-          <w:hyperlink w:anchor="_Toc203038449" w:history="1">
+          <w:hyperlink w:anchor="_Toc204344274" w:history="1">
             <w:r>
               <w:rPr>
                 <w:rStyle w:val="Hipervnculo"/>
@@ -543,7 +543,7 @@
                 <w:noProof/>
                 <w:webHidden/>
               </w:rPr>
-              <w:instrText xml:space="preserve"> PAGEREF _Toc203038449 \h </w:instrText>
+              <w:instrText xml:space="preserve"> PAGEREF _Toc204344274 \h </w:instrText>
             </w:r>
             <w:r>
               <w:rPr>
@@ -590,7 +590,7 @@
               <w14:ligatures w14:val="none"/>
             </w:rPr>
           </w:pPr>
-          <w:hyperlink w:anchor="_Toc203038450" w:history="1">
+          <w:hyperlink w:anchor="_Toc204344275" w:history="1">
             <w:r>
               <w:rPr>
                 <w:rStyle w:val="Hipervnculo"/>
@@ -635,7 +635,7 @@
                 <w:noProof/>
                 <w:webHidden/>
               </w:rPr>
-              <w:instrText xml:space="preserve"> PAGEREF _Toc203038450 \h </w:instrText>
+              <w:instrText xml:space="preserve"> PAGEREF _Toc204344275 \h </w:instrText>
             </w:r>
             <w:r>
               <w:rPr>
@@ -678,7 +678,7 @@
               <w14:ligatures w14:val="none"/>
             </w:rPr>
           </w:pPr>
-          <w:hyperlink w:anchor="_Toc203038451" w:history="1">
+          <w:hyperlink w:anchor="_Toc204344276" w:history="1">
             <w:r>
               <w:rPr>
                 <w:rStyle w:val="Hipervnculo"/>
@@ -723,7 +723,7 @@
                 <w:noProof/>
                 <w:webHidden/>
               </w:rPr>
-              <w:instrText xml:space="preserve"> PAGEREF _Toc203038451 \h </w:instrText>
+              <w:instrText xml:space="preserve"> PAGEREF _Toc204344276 \h </w:instrText>
             </w:r>
             <w:r>
               <w:rPr>
@@ -766,7 +766,7 @@
               <w14:ligatures w14:val="none"/>
             </w:rPr>
           </w:pPr>
-          <w:hyperlink w:anchor="_Toc203038452" w:history="1">
+          <w:hyperlink w:anchor="_Toc204344277" w:history="1">
             <w:r>
               <w:rPr>
                 <w:rStyle w:val="Hipervnculo"/>
@@ -811,7 +811,7 @@
                 <w:noProof/>
                 <w:webHidden/>
               </w:rPr>
-              <w:instrText xml:space="preserve"> PAGEREF _Toc203038452 \h </w:instrText>
+              <w:instrText xml:space="preserve"> PAGEREF _Toc204344277 \h </w:instrText>
             </w:r>
             <w:r>
               <w:rPr>
@@ -858,7 +858,7 @@
               <w14:ligatures w14:val="none"/>
             </w:rPr>
           </w:pPr>
-          <w:hyperlink w:anchor="_Toc203038453" w:history="1">
+          <w:hyperlink w:anchor="_Toc204344278" w:history="1">
             <w:r>
               <w:rPr>
                 <w:rStyle w:val="Hipervnculo"/>
@@ -903,7 +903,7 @@
                 <w:noProof/>
                 <w:webHidden/>
               </w:rPr>
-              <w:instrText xml:space="preserve"> PAGEREF _Toc203038453 \h </w:instrText>
+              <w:instrText xml:space="preserve"> PAGEREF _Toc204344278 \h </w:instrText>
             </w:r>
             <w:r>
               <w:rPr>
@@ -946,7 +946,7 @@
               <w14:ligatures w14:val="none"/>
             </w:rPr>
           </w:pPr>
-          <w:hyperlink w:anchor="_Toc203038454" w:history="1">
+          <w:hyperlink w:anchor="_Toc204344279" w:history="1">
             <w:r>
               <w:rPr>
                 <w:rStyle w:val="Hipervnculo"/>
@@ -991,7 +991,7 @@
                 <w:noProof/>
                 <w:webHidden/>
               </w:rPr>
-              <w:instrText xml:space="preserve"> PAGEREF _Toc203038454 \h </w:instrText>
+              <w:instrText xml:space="preserve"> PAGEREF _Toc204344279 \h </w:instrText>
             </w:r>
             <w:r>
               <w:rPr>
@@ -1034,7 +1034,7 @@
               <w14:ligatures w14:val="none"/>
             </w:rPr>
           </w:pPr>
-          <w:hyperlink w:anchor="_Toc203038455" w:history="1">
+          <w:hyperlink w:anchor="_Toc204344280" w:history="1">
             <w:r>
               <w:rPr>
                 <w:rStyle w:val="Hipervnculo"/>
@@ -1079,7 +1079,7 @@
                 <w:noProof/>
                 <w:webHidden/>
               </w:rPr>
-              <w:instrText xml:space="preserve"> PAGEREF _Toc203038455 \h </w:instrText>
+              <w:instrText xml:space="preserve"> PAGEREF _Toc204344280 \h </w:instrText>
             </w:r>
             <w:r>
               <w:rPr>
@@ -1126,7 +1126,7 @@
               <w14:ligatures w14:val="none"/>
             </w:rPr>
           </w:pPr>
-          <w:hyperlink w:anchor="_Toc203038456" w:history="1">
+          <w:hyperlink w:anchor="_Toc204344281" w:history="1">
             <w:r>
               <w:rPr>
                 <w:rStyle w:val="Hipervnculo"/>
@@ -1171,7 +1171,7 @@
                 <w:noProof/>
                 <w:webHidden/>
               </w:rPr>
-              <w:instrText xml:space="preserve"> PAGEREF _Toc203038456 \h </w:instrText>
+              <w:instrText xml:space="preserve"> PAGEREF _Toc204344281 \h </w:instrText>
             </w:r>
             <w:r>
               <w:rPr>
@@ -1214,7 +1214,7 @@
               <w14:ligatures w14:val="none"/>
             </w:rPr>
           </w:pPr>
-          <w:hyperlink w:anchor="_Toc203038457" w:history="1">
+          <w:hyperlink w:anchor="_Toc204344282" w:history="1">
             <w:r>
               <w:rPr>
                 <w:rStyle w:val="Hipervnculo"/>
@@ -1259,7 +1259,7 @@
                 <w:noProof/>
                 <w:webHidden/>
               </w:rPr>
-              <w:instrText xml:space="preserve"> PAGEREF _Toc203038457 \h </w:instrText>
+              <w:instrText xml:space="preserve"> PAGEREF _Toc204344282 \h </w:instrText>
             </w:r>
             <w:r>
               <w:rPr>
@@ -1302,7 +1302,7 @@
               <w14:ligatures w14:val="none"/>
             </w:rPr>
           </w:pPr>
-          <w:hyperlink w:anchor="_Toc203038458" w:history="1">
+          <w:hyperlink w:anchor="_Toc204344283" w:history="1">
             <w:r>
               <w:rPr>
                 <w:rStyle w:val="Hipervnculo"/>
@@ -1347,7 +1347,7 @@
                 <w:noProof/>
                 <w:webHidden/>
               </w:rPr>
-              <w:instrText xml:space="preserve"> PAGEREF _Toc203038458 \h </w:instrText>
+              <w:instrText xml:space="preserve"> PAGEREF _Toc204344283 \h </w:instrText>
             </w:r>
             <w:r>
               <w:rPr>
@@ -1390,7 +1390,7 @@
               <w14:ligatures w14:val="none"/>
             </w:rPr>
           </w:pPr>
-          <w:hyperlink w:anchor="_Toc203038459" w:history="1">
+          <w:hyperlink w:anchor="_Toc204344284" w:history="1">
             <w:r>
               <w:rPr>
                 <w:rStyle w:val="Hipervnculo"/>
@@ -1435,7 +1435,7 @@
                 <w:noProof/>
                 <w:webHidden/>
               </w:rPr>
-              <w:instrText xml:space="preserve"> PAGEREF _Toc203038459 \h </w:instrText>
+              <w:instrText xml:space="preserve"> PAGEREF _Toc204344284 \h </w:instrText>
             </w:r>
             <w:r>
               <w:rPr>
@@ -1482,7 +1482,7 @@
               <w14:ligatures w14:val="none"/>
             </w:rPr>
           </w:pPr>
-          <w:hyperlink w:anchor="_Toc203038460" w:history="1">
+          <w:hyperlink w:anchor="_Toc204344285" w:history="1">
             <w:r>
               <w:rPr>
                 <w:rStyle w:val="Hipervnculo"/>
@@ -1527,7 +1527,7 @@
                 <w:noProof/>
                 <w:webHidden/>
               </w:rPr>
-              <w:instrText xml:space="preserve"> PAGEREF _Toc203038460 \h </w:instrText>
+              <w:instrText xml:space="preserve"> PAGEREF _Toc204344285 \h </w:instrText>
             </w:r>
             <w:r>
               <w:rPr>
@@ -1570,7 +1570,7 @@
               <w14:ligatures w14:val="none"/>
             </w:rPr>
           </w:pPr>
-          <w:hyperlink w:anchor="_Toc203038461" w:history="1">
+          <w:hyperlink w:anchor="_Toc204344286" w:history="1">
             <w:r>
               <w:rPr>
                 <w:rStyle w:val="Hipervnculo"/>
@@ -1615,7 +1615,7 @@
                 <w:noProof/>
                 <w:webHidden/>
               </w:rPr>
-              <w:instrText xml:space="preserve"> PAGEREF _Toc203038461 \h </w:instrText>
+              <w:instrText xml:space="preserve"> PAGEREF _Toc204344286 \h </w:instrText>
             </w:r>
             <w:r>
               <w:rPr>
@@ -1658,7 +1658,7 @@
               <w14:ligatures w14:val="none"/>
             </w:rPr>
           </w:pPr>
-          <w:hyperlink w:anchor="_Toc203038462" w:history="1">
+          <w:hyperlink w:anchor="_Toc204344287" w:history="1">
             <w:r>
               <w:rPr>
                 <w:rStyle w:val="Hipervnculo"/>
@@ -1703,7 +1703,7 @@
                 <w:noProof/>
                 <w:webHidden/>
               </w:rPr>
-              <w:instrText xml:space="preserve"> PAGEREF _Toc203038462 \h </w:instrText>
+              <w:instrText xml:space="preserve"> PAGEREF _Toc204344287 \h </w:instrText>
             </w:r>
             <w:r>
               <w:rPr>
@@ -1750,7 +1750,7 @@
               <w14:ligatures w14:val="none"/>
             </w:rPr>
           </w:pPr>
-          <w:hyperlink w:anchor="_Toc203038463" w:history="1">
+          <w:hyperlink w:anchor="_Toc204344288" w:history="1">
             <w:r>
               <w:rPr>
                 <w:rStyle w:val="Hipervnculo"/>
@@ -1795,7 +1795,7 @@
                 <w:noProof/>
                 <w:webHidden/>
               </w:rPr>
-              <w:instrText xml:space="preserve"> PAGEREF _Toc203038463 \h </w:instrText>
+              <w:instrText xml:space="preserve"> PAGEREF _Toc204344288 \h </w:instrText>
             </w:r>
             <w:r>
               <w:rPr>
@@ -1838,7 +1838,7 @@
               <w14:ligatures w14:val="none"/>
             </w:rPr>
           </w:pPr>
-          <w:hyperlink w:anchor="_Toc203038464" w:history="1">
+          <w:hyperlink w:anchor="_Toc204344289" w:history="1">
             <w:r>
               <w:rPr>
                 <w:rStyle w:val="Hipervnculo"/>
@@ -1883,7 +1883,7 @@
                 <w:noProof/>
                 <w:webHidden/>
               </w:rPr>
-              <w:instrText xml:space="preserve"> PAGEREF _Toc203038464 \h </w:instrText>
+              <w:instrText xml:space="preserve"> PAGEREF _Toc204344289 \h </w:instrText>
             </w:r>
             <w:r>
               <w:rPr>
@@ -1926,7 +1926,7 @@
               <w14:ligatures w14:val="none"/>
             </w:rPr>
           </w:pPr>
-          <w:hyperlink w:anchor="_Toc203038465" w:history="1">
+          <w:hyperlink w:anchor="_Toc204344290" w:history="1">
             <w:r>
               <w:rPr>
                 <w:rStyle w:val="Hipervnculo"/>
@@ -1971,7 +1971,7 @@
                 <w:noProof/>
                 <w:webHidden/>
               </w:rPr>
-              <w:instrText xml:space="preserve"> PAGEREF _Toc203038465 \h </w:instrText>
+              <w:instrText xml:space="preserve"> PAGEREF _Toc204344290 \h </w:instrText>
             </w:r>
             <w:r>
               <w:rPr>
@@ -2014,7 +2014,7 @@
               <w14:ligatures w14:val="none"/>
             </w:rPr>
           </w:pPr>
-          <w:hyperlink w:anchor="_Toc203038466" w:history="1">
+          <w:hyperlink w:anchor="_Toc204344291" w:history="1">
             <w:r>
               <w:rPr>
                 <w:rStyle w:val="Hipervnculo"/>
@@ -2059,7 +2059,7 @@
                 <w:noProof/>
                 <w:webHidden/>
               </w:rPr>
-              <w:instrText xml:space="preserve"> PAGEREF _Toc203038466 \h </w:instrText>
+              <w:instrText xml:space="preserve"> PAGEREF _Toc204344291 \h </w:instrText>
             </w:r>
             <w:r>
               <w:rPr>
@@ -2102,7 +2102,7 @@
               <w14:ligatures w14:val="none"/>
             </w:rPr>
           </w:pPr>
-          <w:hyperlink w:anchor="_Toc203038467" w:history="1">
+          <w:hyperlink w:anchor="_Toc204344292" w:history="1">
             <w:r>
               <w:rPr>
                 <w:rStyle w:val="Hipervnculo"/>
@@ -2147,7 +2147,7 @@
                 <w:noProof/>
                 <w:webHidden/>
               </w:rPr>
-              <w:instrText xml:space="preserve"> PAGEREF _Toc203038467 \h </w:instrText>
+              <w:instrText xml:space="preserve"> PAGEREF _Toc204344292 \h </w:instrText>
             </w:r>
             <w:r>
               <w:rPr>
@@ -2190,7 +2190,7 @@
               <w14:ligatures w14:val="none"/>
             </w:rPr>
           </w:pPr>
-          <w:hyperlink w:anchor="_Toc203038468" w:history="1">
+          <w:hyperlink w:anchor="_Toc204344293" w:history="1">
             <w:r>
               <w:rPr>
                 <w:rStyle w:val="Hipervnculo"/>
@@ -2235,7 +2235,7 @@
                 <w:noProof/>
                 <w:webHidden/>
               </w:rPr>
-              <w:instrText xml:space="preserve"> PAGEREF _Toc203038468 \h </w:instrText>
+              <w:instrText xml:space="preserve"> PAGEREF _Toc204344293 \h </w:instrText>
             </w:r>
             <w:r>
               <w:rPr>
@@ -2282,7 +2282,7 @@
               <w14:ligatures w14:val="none"/>
             </w:rPr>
           </w:pPr>
-          <w:hyperlink w:anchor="_Toc203038469" w:history="1">
+          <w:hyperlink w:anchor="_Toc204344294" w:history="1">
             <w:r>
               <w:rPr>
                 <w:rStyle w:val="Hipervnculo"/>
@@ -2327,7 +2327,7 @@
                 <w:noProof/>
                 <w:webHidden/>
               </w:rPr>
-              <w:instrText xml:space="preserve"> PAGEREF _Toc203038469 \h </w:instrText>
+              <w:instrText xml:space="preserve"> PAGEREF _Toc204344294 \h </w:instrText>
             </w:r>
             <w:r>
               <w:rPr>
@@ -2370,7 +2370,7 @@
               <w14:ligatures w14:val="none"/>
             </w:rPr>
           </w:pPr>
-          <w:hyperlink w:anchor="_Toc203038470" w:history="1">
+          <w:hyperlink w:anchor="_Toc204344295" w:history="1">
             <w:r>
               <w:rPr>
                 <w:rStyle w:val="Hipervnculo"/>
@@ -2415,7 +2415,7 @@
                 <w:noProof/>
                 <w:webHidden/>
               </w:rPr>
-              <w:instrText xml:space="preserve"> PAGEREF _Toc203038470 \h </w:instrText>
+              <w:instrText xml:space="preserve"> PAGEREF _Toc204344295 \h </w:instrText>
             </w:r>
             <w:r>
               <w:rPr>
@@ -2458,7 +2458,7 @@
               <w14:ligatures w14:val="none"/>
             </w:rPr>
           </w:pPr>
-          <w:hyperlink w:anchor="_Toc203038471" w:history="1">
+          <w:hyperlink w:anchor="_Toc204344296" w:history="1">
             <w:r>
               <w:rPr>
                 <w:rStyle w:val="Hipervnculo"/>
@@ -2503,7 +2503,7 @@
                 <w:noProof/>
                 <w:webHidden/>
               </w:rPr>
-              <w:instrText xml:space="preserve"> PAGEREF _Toc203038471 \h </w:instrText>
+              <w:instrText xml:space="preserve"> PAGEREF _Toc204344296 \h </w:instrText>
             </w:r>
             <w:r>
               <w:rPr>
@@ -2546,7 +2546,7 @@
               <w14:ligatures w14:val="none"/>
             </w:rPr>
           </w:pPr>
-          <w:hyperlink w:anchor="_Toc203038472" w:history="1">
+          <w:hyperlink w:anchor="_Toc204344297" w:history="1">
             <w:r>
               <w:rPr>
                 <w:rStyle w:val="Hipervnculo"/>
@@ -2591,7 +2591,7 @@
                 <w:noProof/>
                 <w:webHidden/>
               </w:rPr>
-              <w:instrText xml:space="preserve"> PAGEREF _Toc203038472 \h </w:instrText>
+              <w:instrText xml:space="preserve"> PAGEREF _Toc204344297 \h </w:instrText>
             </w:r>
             <w:r>
               <w:rPr>
@@ -2638,7 +2638,7 @@
               <w14:ligatures w14:val="none"/>
             </w:rPr>
           </w:pPr>
-          <w:hyperlink w:anchor="_Toc203038473" w:history="1">
+          <w:hyperlink w:anchor="_Toc204344298" w:history="1">
             <w:r>
               <w:rPr>
                 <w:rStyle w:val="Hipervnculo"/>
@@ -2683,7 +2683,7 @@
                 <w:noProof/>
                 <w:webHidden/>
               </w:rPr>
-              <w:instrText xml:space="preserve"> PAGEREF _Toc203038473 \h </w:instrText>
+              <w:instrText xml:space="preserve"> PAGEREF _Toc204344298 \h </w:instrText>
             </w:r>
             <w:r>
               <w:rPr>
@@ -2726,7 +2726,7 @@
               <w14:ligatures w14:val="none"/>
             </w:rPr>
           </w:pPr>
-          <w:hyperlink w:anchor="_Toc203038474" w:history="1">
+          <w:hyperlink w:anchor="_Toc204344299" w:history="1">
             <w:r>
               <w:rPr>
                 <w:rStyle w:val="Hipervnculo"/>
@@ -2771,7 +2771,7 @@
                 <w:noProof/>
                 <w:webHidden/>
               </w:rPr>
-              <w:instrText xml:space="preserve"> PAGEREF _Toc203038474 \h </w:instrText>
+              <w:instrText xml:space="preserve"> PAGEREF _Toc204344299 \h </w:instrText>
             </w:r>
             <w:r>
               <w:rPr>
@@ -2814,7 +2814,7 @@
               <w14:ligatures w14:val="none"/>
             </w:rPr>
           </w:pPr>
-          <w:hyperlink w:anchor="_Toc203038475" w:history="1">
+          <w:hyperlink w:anchor="_Toc204344300" w:history="1">
             <w:r>
               <w:rPr>
                 <w:rStyle w:val="Hipervnculo"/>
@@ -2859,7 +2859,7 @@
                 <w:noProof/>
                 <w:webHidden/>
               </w:rPr>
-              <w:instrText xml:space="preserve"> PAGEREF _Toc203038475 \h </w:instrText>
+              <w:instrText xml:space="preserve"> PAGEREF _Toc204344300 \h </w:instrText>
             </w:r>
             <w:r>
               <w:rPr>
@@ -2902,7 +2902,7 @@
               <w14:ligatures w14:val="none"/>
             </w:rPr>
           </w:pPr>
-          <w:hyperlink w:anchor="_Toc203038476" w:history="1">
+          <w:hyperlink w:anchor="_Toc204344301" w:history="1">
             <w:r>
               <w:rPr>
                 <w:rStyle w:val="Hipervnculo"/>
@@ -2947,7 +2947,7 @@
                 <w:noProof/>
                 <w:webHidden/>
               </w:rPr>
-              <w:instrText xml:space="preserve"> PAGEREF _Toc203038476 \h </w:instrText>
+              <w:instrText xml:space="preserve"> PAGEREF _Toc204344301 \h </w:instrText>
             </w:r>
             <w:r>
               <w:rPr>
@@ -2993,7 +2993,7 @@
               <w14:ligatures w14:val="none"/>
             </w:rPr>
           </w:pPr>
-          <w:hyperlink w:anchor="_Toc203038477" w:history="1">
+          <w:hyperlink w:anchor="_Toc204344302" w:history="1">
             <w:r>
               <w:rPr>
                 <w:rStyle w:val="Hipervnculo"/>
@@ -3020,7 +3020,7 @@
                 <w:noProof/>
                 <w:webHidden/>
               </w:rPr>
-              <w:instrText xml:space="preserve"> PAGEREF _Toc203038477 \h </w:instrText>
+              <w:instrText xml:space="preserve"> PAGEREF _Toc204344302 \h </w:instrText>
             </w:r>
             <w:r>
               <w:rPr>
@@ -3066,7 +3066,7 @@
               <w14:ligatures w14:val="none"/>
             </w:rPr>
           </w:pPr>
-          <w:hyperlink w:anchor="_Toc203038478" w:history="1">
+          <w:hyperlink w:anchor="_Toc204344303" w:history="1">
             <w:r>
               <w:rPr>
                 <w:rStyle w:val="Hipervnculo"/>
@@ -3093,7 +3093,7 @@
                 <w:noProof/>
                 <w:webHidden/>
               </w:rPr>
-              <w:instrText xml:space="preserve"> PAGEREF _Toc203038478 \h </w:instrText>
+              <w:instrText xml:space="preserve"> PAGEREF _Toc204344303 \h </w:instrText>
             </w:r>
             <w:r>
               <w:rPr>
@@ -3139,7 +3139,7 @@
               <w14:ligatures w14:val="none"/>
             </w:rPr>
           </w:pPr>
-          <w:hyperlink w:anchor="_Toc203038479" w:history="1">
+          <w:hyperlink w:anchor="_Toc204344304" w:history="1">
             <w:r>
               <w:rPr>
                 <w:rStyle w:val="Hipervnculo"/>
@@ -3166,7 +3166,7 @@
                 <w:noProof/>
                 <w:webHidden/>
               </w:rPr>
-              <w:instrText xml:space="preserve"> PAGEREF _Toc203038479 \h </w:instrText>
+              <w:instrText xml:space="preserve"> PAGEREF _Toc204344304 \h </w:instrText>
             </w:r>
             <w:r>
               <w:rPr>
@@ -3212,7 +3212,7 @@
               <w14:ligatures w14:val="none"/>
             </w:rPr>
           </w:pPr>
-          <w:hyperlink w:anchor="_Toc203038480" w:history="1">
+          <w:hyperlink w:anchor="_Toc204344305" w:history="1">
             <w:r>
               <w:rPr>
                 <w:rStyle w:val="Hipervnculo"/>
@@ -3239,7 +3239,7 @@
                 <w:noProof/>
                 <w:webHidden/>
               </w:rPr>
-              <w:instrText xml:space="preserve"> PAGEREF _Toc203038480 \h </w:instrText>
+              <w:instrText xml:space="preserve"> PAGEREF _Toc204344305 \h </w:instrText>
             </w:r>
             <w:r>
               <w:rPr>
@@ -3285,7 +3285,7 @@
               <w14:ligatures w14:val="none"/>
             </w:rPr>
           </w:pPr>
-          <w:hyperlink w:anchor="_Toc203038481" w:history="1">
+          <w:hyperlink w:anchor="_Toc204344306" w:history="1">
             <w:r>
               <w:rPr>
                 <w:rStyle w:val="Hipervnculo"/>
@@ -3312,7 +3312,7 @@
                 <w:noProof/>
                 <w:webHidden/>
               </w:rPr>
-              <w:instrText xml:space="preserve"> PAGEREF _Toc203038481 \h </w:instrText>
+              <w:instrText xml:space="preserve"> PAGEREF _Toc204344306 \h </w:instrText>
             </w:r>
             <w:r>
               <w:rPr>
@@ -3377,7 +3377,7 @@
       <w:pPr>
         <w:pStyle w:val="Titulosgenerales"/>
       </w:pPr>
-      <w:bookmarkStart w:id="0" w:name="_Toc203038449"/>
+      <w:bookmarkStart w:id="0" w:name="_Toc204344274"/>
       <w:r>
         <w:lastRenderedPageBreak/>
         <w:t>Introducción</w:t>
@@ -3436,10 +3436,10 @@
           <w:noProof/>
         </w:rPr>
         <w:drawing>
-          <wp:inline distT="0" distB="0" distL="0" distR="0" wp14:anchorId="0B4BC60A" wp14:editId="4A9E27FC">
-            <wp:extent cx="4288727" cy="2413591"/>
-            <wp:effectExtent l="0" t="0" r="0" b="6350"/>
-            <wp:docPr id="4" name="Imagen 4">
+          <wp:inline distT="0" distB="0" distL="0" distR="0" wp14:anchorId="6ED11C10" wp14:editId="5DB8C79C">
+            <wp:extent cx="3713259" cy="2090477"/>
+            <wp:effectExtent l="0" t="0" r="1905" b="5080"/>
+            <wp:docPr id="6" name="Imagen 6">
               <a:extLst xmlns:a="http://schemas.openxmlformats.org/drawingml/2006/main">
                 <a:ext uri="{C183D7F6-B498-43B3-948B-1728B52AA6E4}">
                   <adec:decorative xmlns:adec="http://schemas.microsoft.com/office/drawing/2017/decorative" val="1"/>
@@ -3453,7 +3453,7 @@
               <a:graphicData uri="http://schemas.openxmlformats.org/drawingml/2006/picture">
                 <pic:pic xmlns:pic="http://schemas.openxmlformats.org/drawingml/2006/picture">
                   <pic:nvPicPr>
-                    <pic:cNvPr id="4" name="Imagen 4">
+                    <pic:cNvPr id="6" name="Imagen 6">
                       <a:extLst>
                         <a:ext uri="{C183D7F6-B498-43B3-948B-1728B52AA6E4}">
                           <adec:decorative xmlns:adec="http://schemas.microsoft.com/office/drawing/2017/decorative" val="1"/>
@@ -3480,7 +3480,7 @@
                   <pic:spPr bwMode="auto">
                     <a:xfrm>
                       <a:off x="0" y="0"/>
-                      <a:ext cx="4306906" cy="2423822"/>
+                      <a:ext cx="3723372" cy="2096170"/>
                     </a:xfrm>
                     <a:prstGeom prst="rect">
                       <a:avLst/>
@@ -3502,27 +3502,42 @@
       <w:pPr>
         <w:ind w:firstLine="0"/>
         <w:rPr>
-          <w:noProof/>
-        </w:rPr>
-      </w:pPr>
-      <w:r>
-        <w:rPr>
-          <w:noProof/>
-        </w:rPr>
-        <w:lastRenderedPageBreak/>
-        <w:t xml:space="preserve">                      </w:t>
-      </w:r>
-    </w:p>
-    <w:p>
-      <w:pPr>
-        <w:ind w:firstLine="0"/>
-        <w:jc w:val="center"/>
-        <w:rPr>
           <w:b/>
           <w:u w:val="single"/>
           <w:lang w:val="es-419"/>
         </w:rPr>
       </w:pPr>
+      <w:r>
+        <w:rPr>
+          <w:noProof/>
+        </w:rPr>
+        <w:lastRenderedPageBreak/>
+        <w:t xml:space="preserve">                      </w:t>
+      </w:r>
+      <w:r>
+        <w:rPr>
+          <w:noProof/>
+        </w:rPr>
+        <w:tab/>
+      </w:r>
+      <w:r>
+        <w:rPr>
+          <w:noProof/>
+        </w:rPr>
+        <w:tab/>
+      </w:r>
+      <w:r>
+        <w:rPr>
+          <w:noProof/>
+        </w:rPr>
+        <w:tab/>
+      </w:r>
+      <w:r>
+        <w:rPr>
+          <w:noProof/>
+        </w:rPr>
+        <w:tab/>
+      </w:r>
       <w:hyperlink r:id="rId14" w:history="1">
         <w:r>
           <w:rPr>
@@ -3695,32 +3710,32 @@
               <w:rPr>
                 <w:lang w:val="es-419"/>
               </w:rPr>
+              <w:t>Asimismo, aprenderá a utilizar herramientas como el análisis situacional, matrices estratégicas</w:t>
+            </w:r>
+            <w:r>
+              <w:rPr>
+                <w:lang w:val="es-419"/>
+              </w:rPr>
+              <w:t xml:space="preserve"> </w:t>
+            </w:r>
+            <w:r>
+              <w:rPr>
+                <w:lang w:val="es-419"/>
+              </w:rPr>
+              <w:t>y otras metodologías que le permitirán evaluar oportunidades, riesgos y tendencias del mercado global.</w:t>
+            </w:r>
+          </w:p>
+          <w:p>
+            <w:pPr>
+              <w:rPr>
+                <w:lang w:val="es-419"/>
+              </w:rPr>
+            </w:pPr>
+            <w:r>
+              <w:rPr>
+                <w:lang w:val="es-419"/>
+              </w:rPr>
               <w:lastRenderedPageBreak/>
-              <w:t>Asimismo, aprenderá a utilizar herramientas como el análisis situacional, matrices estratégicas</w:t>
-            </w:r>
-            <w:r>
-              <w:rPr>
-                <w:lang w:val="es-419"/>
-              </w:rPr>
-              <w:t xml:space="preserve"> </w:t>
-            </w:r>
-            <w:r>
-              <w:rPr>
-                <w:lang w:val="es-419"/>
-              </w:rPr>
-              <w:t>y otras metodologías que le permitirán evaluar oportunidades, riesgos y tendencias del mercado global.</w:t>
-            </w:r>
-          </w:p>
-          <w:p>
-            <w:pPr>
-              <w:rPr>
-                <w:lang w:val="es-419"/>
-              </w:rPr>
-            </w:pPr>
-            <w:r>
-              <w:rPr>
-                <w:lang w:val="es-419"/>
-              </w:rPr>
               <w:t>Lo invitamos a participar activamente en este proceso de formación, que no solo ampliará su panorama profesional,</w:t>
             </w:r>
             <w:r>
@@ -3781,7 +3796,7 @@
       <w:pPr>
         <w:pStyle w:val="Ttulo1"/>
       </w:pPr>
-      <w:bookmarkStart w:id="1" w:name="_Toc203038450"/>
+      <w:bookmarkStart w:id="1" w:name="_Toc204344275"/>
       <w:r>
         <w:lastRenderedPageBreak/>
         <w:t>Mercado</w:t>
@@ -3812,7 +3827,7 @@
       <w:pPr>
         <w:pStyle w:val="Ttulo2"/>
       </w:pPr>
-      <w:bookmarkStart w:id="2" w:name="_Toc203038451"/>
+      <w:bookmarkStart w:id="2" w:name="_Toc204344276"/>
       <w:r>
         <w:t>Concepto</w:t>
       </w:r>
@@ -3851,7 +3866,7 @@
       <w:pPr>
         <w:pStyle w:val="Ttulo2"/>
       </w:pPr>
-      <w:bookmarkStart w:id="3" w:name="_Toc203038452"/>
+      <w:bookmarkStart w:id="3" w:name="_Toc204344277"/>
       <w:r>
         <w:lastRenderedPageBreak/>
         <w:t>Tipos</w:t>
@@ -4239,7 +4254,7 @@
       <w:pPr>
         <w:pStyle w:val="Ttulo1"/>
       </w:pPr>
-      <w:bookmarkStart w:id="4" w:name="_Toc203038453"/>
+      <w:bookmarkStart w:id="4" w:name="_Toc204344278"/>
       <w:r>
         <w:lastRenderedPageBreak/>
         <w:t>Mezcla de mercad</w:t>
@@ -4269,7 +4284,7 @@
       <w:pPr>
         <w:pStyle w:val="Ttulo2"/>
       </w:pPr>
-      <w:bookmarkStart w:id="5" w:name="_Toc203038454"/>
+      <w:bookmarkStart w:id="5" w:name="_Toc204344279"/>
       <w:r>
         <w:t>Concepto</w:t>
       </w:r>
@@ -4317,7 +4332,7 @@
       <w:pPr>
         <w:pStyle w:val="Ttulo2"/>
       </w:pPr>
-      <w:bookmarkStart w:id="6" w:name="_Toc203038455"/>
+      <w:bookmarkStart w:id="6" w:name="_Toc204344280"/>
       <w:r>
         <w:t>Elementos</w:t>
       </w:r>
@@ -4882,6 +4897,13 @@
               </w:rPr>
               <w:t xml:space="preserve"> </w:t>
             </w:r>
+            <w:r>
+              <w:rPr>
+                <w:bCs/>
+                <w:lang w:val="es-419"/>
+              </w:rPr>
+              <w:t>charlas que venden</w:t>
+            </w:r>
           </w:p>
         </w:tc>
       </w:tr>
@@ -4900,7 +4922,31 @@
               <w:rPr>
                 <w:lang w:val="es-419"/>
               </w:rPr>
-              <w:t xml:space="preserve">¡Hola, hola! Bienvenidos a Charlas que Venden, el espacio donde aprendemos de mercadeo sin quedarnos dormidos. Soy Carlos, instructor del SENA, y hoy vamos a </w:t>
+              <w:t xml:space="preserve">¡Hola, hola! Bienvenidos a </w:t>
+            </w:r>
+            <w:r>
+              <w:rPr>
+                <w:lang w:val="es-419"/>
+              </w:rPr>
+              <w:t>c</w:t>
+            </w:r>
+            <w:r>
+              <w:rPr>
+                <w:lang w:val="es-419"/>
+              </w:rPr>
+              <w:t xml:space="preserve">harlas que </w:t>
+            </w:r>
+            <w:r>
+              <w:rPr>
+                <w:lang w:val="es-419"/>
+              </w:rPr>
+              <w:t>v</w:t>
+            </w:r>
+            <w:r>
+              <w:rPr>
+                <w:lang w:val="es-419"/>
+              </w:rPr>
+              <w:t xml:space="preserve">enden, el espacio donde aprendemos de mercadeo sin quedarnos dormidos. Soy Carlos, instructor del SENA, y hoy vamos a </w:t>
             </w:r>
             <w:r>
               <w:rPr>
@@ -5555,7 +5601,7 @@
       <w:pPr>
         <w:pStyle w:val="Ttulo1"/>
       </w:pPr>
-      <w:bookmarkStart w:id="7" w:name="_Toc203038456"/>
+      <w:bookmarkStart w:id="7" w:name="_Toc204344281"/>
       <w:r>
         <w:lastRenderedPageBreak/>
         <w:t>Mercadeo internacional</w:t>
@@ -5585,7 +5631,7 @@
       <w:pPr>
         <w:pStyle w:val="Ttulo2"/>
       </w:pPr>
-      <w:bookmarkStart w:id="8" w:name="_Toc203038457"/>
+      <w:bookmarkStart w:id="8" w:name="_Toc204344282"/>
       <w:r>
         <w:t>Concepto</w:t>
       </w:r>
@@ -5715,7 +5761,7 @@
       <w:pPr>
         <w:pStyle w:val="Ttulo2"/>
       </w:pPr>
-      <w:bookmarkStart w:id="9" w:name="_Toc203038458"/>
+      <w:bookmarkStart w:id="9" w:name="_Toc204344283"/>
       <w:r>
         <w:t>Objetivo</w:t>
       </w:r>
@@ -6033,7 +6079,7 @@
       <w:pPr>
         <w:pStyle w:val="Ttulo2"/>
       </w:pPr>
-      <w:bookmarkStart w:id="10" w:name="_Toc203038459"/>
+      <w:bookmarkStart w:id="10" w:name="_Toc204344284"/>
       <w:r>
         <w:lastRenderedPageBreak/>
         <w:t>Beneficios</w:t>
@@ -6360,7 +6406,7 @@
       <w:pPr>
         <w:pStyle w:val="Ttulo1"/>
       </w:pPr>
-      <w:bookmarkStart w:id="11" w:name="_Toc203038460"/>
+      <w:bookmarkStart w:id="11" w:name="_Toc204344285"/>
       <w:r>
         <w:lastRenderedPageBreak/>
         <w:t>E</w:t>
@@ -6387,7 +6433,7 @@
       <w:pPr>
         <w:pStyle w:val="Ttulo2"/>
       </w:pPr>
-      <w:bookmarkStart w:id="12" w:name="_Toc203038461"/>
+      <w:bookmarkStart w:id="12" w:name="_Toc204344286"/>
       <w:r>
         <w:t>Conceptos</w:t>
       </w:r>
@@ -6423,7 +6469,7 @@
       <w:pPr>
         <w:pStyle w:val="Ttulo2"/>
       </w:pPr>
-      <w:bookmarkStart w:id="13" w:name="_Toc203038462"/>
+      <w:bookmarkStart w:id="13" w:name="_Toc204344287"/>
       <w:r>
         <w:t>Variables</w:t>
       </w:r>
@@ -6517,6 +6563,7 @@
           <w:p>
             <w:pPr>
               <w:pStyle w:val="TextoTablas"/>
+              <w:jc w:val="center"/>
               <w:rPr>
                 <w:rFonts w:asciiTheme="minorHAnsi" w:hAnsiTheme="minorHAnsi" w:cs="Arial"/>
                 <w:bCs/>
@@ -6542,6 +6589,7 @@
           <w:p>
             <w:pPr>
               <w:pStyle w:val="TextoTablas"/>
+              <w:jc w:val="center"/>
               <w:rPr>
                 <w:rFonts w:asciiTheme="minorHAnsi" w:hAnsiTheme="minorHAnsi" w:cs="Arial"/>
                 <w:bCs/>
@@ -6567,6 +6615,7 @@
           <w:p>
             <w:pPr>
               <w:pStyle w:val="TextoTablas"/>
+              <w:jc w:val="center"/>
               <w:rPr>
                 <w:rFonts w:asciiTheme="minorHAnsi" w:hAnsiTheme="minorHAnsi" w:cs="Arial"/>
                 <w:bCs/>
@@ -6592,6 +6641,7 @@
           <w:p>
             <w:pPr>
               <w:pStyle w:val="TextoTablas"/>
+              <w:jc w:val="center"/>
               <w:rPr>
                 <w:rFonts w:asciiTheme="minorHAnsi" w:hAnsiTheme="minorHAnsi" w:cs="Arial"/>
                 <w:bCs/>
@@ -6626,6 +6676,7 @@
           <w:p>
             <w:pPr>
               <w:pStyle w:val="TextoTablas"/>
+              <w:jc w:val="center"/>
               <w:rPr>
                 <w:rFonts w:asciiTheme="minorHAnsi" w:hAnsiTheme="minorHAnsi" w:cs="Arial"/>
                 <w:bCs/>
@@ -6651,6 +6702,7 @@
           <w:p>
             <w:pPr>
               <w:pStyle w:val="TextoTablas"/>
+              <w:jc w:val="center"/>
               <w:rPr>
                 <w:rFonts w:asciiTheme="minorHAnsi" w:hAnsiTheme="minorHAnsi" w:cs="Arial"/>
                 <w:bCs/>
@@ -7368,6 +7420,7 @@
           <w:p>
             <w:pPr>
               <w:pStyle w:val="TextoTablas"/>
+              <w:jc w:val="center"/>
               <w:rPr>
                 <w:rFonts w:asciiTheme="minorHAnsi" w:hAnsiTheme="minorHAnsi" w:cs="Arial"/>
                 <w:bCs/>
@@ -7393,6 +7446,7 @@
           <w:p>
             <w:pPr>
               <w:pStyle w:val="TextoTablas"/>
+              <w:jc w:val="center"/>
               <w:rPr>
                 <w:rFonts w:asciiTheme="minorHAnsi" w:hAnsiTheme="minorHAnsi" w:cs="Arial"/>
                 <w:bCs/>
@@ -7418,6 +7472,7 @@
           <w:p>
             <w:pPr>
               <w:pStyle w:val="TextoTablas"/>
+              <w:jc w:val="center"/>
               <w:rPr>
                 <w:rFonts w:asciiTheme="minorHAnsi" w:hAnsiTheme="minorHAnsi" w:cs="Arial"/>
                 <w:bCs/>
@@ -7443,6 +7498,7 @@
           <w:p>
             <w:pPr>
               <w:pStyle w:val="TextoTablas"/>
+              <w:jc w:val="center"/>
               <w:rPr>
                 <w:rFonts w:asciiTheme="minorHAnsi" w:hAnsiTheme="minorHAnsi" w:cs="Arial"/>
                 <w:bCs/>
@@ -7468,6 +7524,7 @@
           <w:p>
             <w:pPr>
               <w:pStyle w:val="TextoTablas"/>
+              <w:jc w:val="center"/>
               <w:rPr>
                 <w:rFonts w:asciiTheme="minorHAnsi" w:hAnsiTheme="minorHAnsi" w:cs="Arial"/>
                 <w:bCs/>
@@ -7493,6 +7550,7 @@
           <w:p>
             <w:pPr>
               <w:pStyle w:val="TextoTablas"/>
+              <w:jc w:val="center"/>
               <w:rPr>
                 <w:rFonts w:asciiTheme="minorHAnsi" w:hAnsiTheme="minorHAnsi" w:cs="Arial"/>
                 <w:bCs/>
@@ -8461,7 +8519,7 @@
       <w:pPr>
         <w:pStyle w:val="Ttulo1"/>
       </w:pPr>
-      <w:bookmarkStart w:id="14" w:name="_Toc203038463"/>
+      <w:bookmarkStart w:id="14" w:name="_Toc204344288"/>
       <w:r>
         <w:lastRenderedPageBreak/>
         <w:t xml:space="preserve">Sistema de información de mercadeo </w:t>
@@ -8491,7 +8549,7 @@
       <w:pPr>
         <w:pStyle w:val="Ttulo2"/>
       </w:pPr>
-      <w:bookmarkStart w:id="15" w:name="_Toc203038464"/>
+      <w:bookmarkStart w:id="15" w:name="_Toc204344289"/>
       <w:r>
         <w:t>Concepto</w:t>
       </w:r>
@@ -8556,7 +8614,7 @@
       <w:pPr>
         <w:pStyle w:val="Ttulo2"/>
       </w:pPr>
-      <w:bookmarkStart w:id="16" w:name="_Toc203038465"/>
+      <w:bookmarkStart w:id="16" w:name="_Toc204344290"/>
       <w:r>
         <w:t>Estructura</w:t>
       </w:r>
@@ -8706,7 +8764,7 @@
       <w:pPr>
         <w:pStyle w:val="Ttulo2"/>
       </w:pPr>
-      <w:bookmarkStart w:id="17" w:name="_Toc203038466"/>
+      <w:bookmarkStart w:id="17" w:name="_Toc204344291"/>
       <w:r>
         <w:t>Funciones</w:t>
       </w:r>
@@ -8857,7 +8915,7 @@
       <w:pPr>
         <w:pStyle w:val="Ttulo2"/>
       </w:pPr>
-      <w:bookmarkStart w:id="18" w:name="_Toc203038467"/>
+      <w:bookmarkStart w:id="18" w:name="_Toc204344292"/>
       <w:r>
         <w:t>Guía implementación SIM</w:t>
       </w:r>
@@ -8880,13 +8938,13 @@
           <w:lang w:val="es-419" w:eastAsia="es-CO"/>
         </w:rPr>
         <w:lastRenderedPageBreak/>
-        <w:t xml:space="preserve">mercados internacionales. Incluye descripciones, herramientas y ejemplos aplicados al caso del aguacate </w:t>
-      </w:r>
-      <w:r>
-        <w:rPr>
-          <w:rStyle w:val="Extranjerismo"/>
-        </w:rPr>
-        <w:t>Hass</w:t>
+        <w:t>mercados internacionales. Incluye descripciones, herramientas y ejemplos aplicados al caso del aguacate</w:t>
+      </w:r>
+      <w:r>
+        <w:rPr>
+          <w:lang w:val="es-419" w:eastAsia="es-CO"/>
+        </w:rPr>
+        <w:t xml:space="preserve"> Hass</w:t>
       </w:r>
       <w:r>
         <w:rPr>
@@ -8987,19 +9045,19 @@
         <w:rPr>
           <w:lang w:val="es-419" w:eastAsia="es-CO"/>
         </w:rPr>
-        <w:t xml:space="preserve">mplica la recolección de datos informales del entorno competitivo, a través de observación directa, interacción con clientes o revisión de fuentes externas. Sirve para detectar oportunidades o amenazas. Ejemplo: se identifican precios por kilo del aguacate </w:t>
-      </w:r>
-      <w:r>
-        <w:rPr>
-          <w:rStyle w:val="Extranjerismo"/>
-        </w:rPr>
-        <w:t>Hass</w:t>
-      </w:r>
-      <w:r>
-        <w:rPr>
-          <w:lang w:val="es-419" w:eastAsia="es-CO"/>
-        </w:rPr>
-        <w:t xml:space="preserve"> en EE.UU. y los requisitos de certificación exigidos por el mercado europeo, ajustando la estrategia comercial según estos hallazgos.</w:t>
+        <w:t>mplica la recolección de datos informales del entorno competitivo, a través de observación directa, interacción con clientes o revisión de fuentes externas. Sirve para detectar oportunidades o amenazas. Ejemplo: se identifican precios por kilo del aguacate</w:t>
+      </w:r>
+      <w:r>
+        <w:rPr>
+          <w:lang w:val="es-419" w:eastAsia="es-CO"/>
+        </w:rPr>
+        <w:t xml:space="preserve"> Hass </w:t>
+      </w:r>
+      <w:r>
+        <w:rPr>
+          <w:lang w:val="es-419" w:eastAsia="es-CO"/>
+        </w:rPr>
+        <w:t>en EE.UU. y los requisitos de certificación exigidos por el mercado europeo, ajustando la estrategia comercial según estos hallazgos.</w:t>
       </w:r>
     </w:p>
     <w:p>
@@ -9082,14 +9140,12 @@
         </w:rPr>
         <w:t xml:space="preserve"> </w:t>
       </w:r>
-      <w:proofErr w:type="spellStart"/>
-      <w:r>
-        <w:rPr>
-          <w:lang w:val="es-419" w:eastAsia="es-CO"/>
+      <w:r>
+        <w:rPr>
+          <w:rStyle w:val="Extranjerismo"/>
         </w:rPr>
         <w:t>groups</w:t>
       </w:r>
-      <w:proofErr w:type="spellEnd"/>
       <w:r>
         <w:rPr>
           <w:lang w:val="es-419" w:eastAsia="es-CO"/>
@@ -9343,7 +9399,7 @@
       <w:pPr>
         <w:pStyle w:val="Ttulo2"/>
       </w:pPr>
-      <w:bookmarkStart w:id="19" w:name="_Toc203038468"/>
+      <w:bookmarkStart w:id="19" w:name="_Toc204344293"/>
       <w:r>
         <w:lastRenderedPageBreak/>
         <w:t>Ejemplo empresarial</w:t>
@@ -9360,41 +9416,13 @@
         <w:rPr>
           <w:lang w:val="es-419" w:eastAsia="es-CO"/>
         </w:rPr>
-        <w:t xml:space="preserve">A continuación, se presenta la experiencia de </w:t>
-      </w:r>
-      <w:proofErr w:type="spellStart"/>
-      <w:r>
-        <w:rPr>
-          <w:lang w:val="es-419" w:eastAsia="es-CO"/>
-        </w:rPr>
-        <w:t>Agroverde</w:t>
-      </w:r>
-      <w:proofErr w:type="spellEnd"/>
-      <w:r>
-        <w:rPr>
-          <w:lang w:val="es-419" w:eastAsia="es-CO"/>
-        </w:rPr>
-        <w:t xml:space="preserve"> </w:t>
-      </w:r>
-      <w:proofErr w:type="spellStart"/>
-      <w:r>
-        <w:rPr>
-          <w:lang w:val="es-419" w:eastAsia="es-CO"/>
-        </w:rPr>
-        <w:t>Export</w:t>
-      </w:r>
-      <w:proofErr w:type="spellEnd"/>
-      <w:r>
-        <w:rPr>
-          <w:lang w:val="es-419" w:eastAsia="es-CO"/>
-        </w:rPr>
-        <w:t xml:space="preserve"> organizada en secciones desplegables, que permiten conocer de forma detallada cómo esta empresa ha estructurado su Sistema de Información de Mercadeo (SIM). Cada apartado describe los elementos clave del sistema, su aplicación en el contexto exportador del aguacate </w:t>
-      </w:r>
-      <w:r>
-        <w:rPr>
-          <w:rStyle w:val="Extranjerismo"/>
-        </w:rPr>
-        <w:t>Hass</w:t>
+        <w:t>A continuación, se presenta la experiencia de Agroverde Export organizada en secciones desplegables, que permiten conocer de forma detallada cómo esta empresa ha estructurado su Sistema de Información de Mercadeo (SIM). Cada apartado describe los elementos clave del sistema, su aplicación en el contexto exportador del aguacate</w:t>
+      </w:r>
+      <w:r>
+        <w:rPr>
+          <w:lang w:val="es-419" w:eastAsia="es-CO"/>
+        </w:rPr>
+        <w:t xml:space="preserve"> Hass</w:t>
       </w:r>
       <w:r>
         <w:rPr>
@@ -9430,39 +9458,17 @@
           <w:lang w:val="es-419" w:eastAsia="es-CO"/>
         </w:rPr>
       </w:pPr>
-      <w:proofErr w:type="spellStart"/>
-      <w:r>
-        <w:rPr>
-          <w:lang w:val="es-419" w:eastAsia="es-CO"/>
-        </w:rPr>
-        <w:t>Agroverde</w:t>
-      </w:r>
-      <w:proofErr w:type="spellEnd"/>
-      <w:r>
-        <w:rPr>
-          <w:lang w:val="es-419" w:eastAsia="es-CO"/>
-        </w:rPr>
-        <w:t xml:space="preserve"> </w:t>
-      </w:r>
-      <w:proofErr w:type="spellStart"/>
-      <w:r>
-        <w:rPr>
-          <w:lang w:val="es-419" w:eastAsia="es-CO"/>
-        </w:rPr>
-        <w:t>Export</w:t>
-      </w:r>
-      <w:proofErr w:type="spellEnd"/>
-      <w:r>
-        <w:rPr>
-          <w:lang w:val="es-419" w:eastAsia="es-CO"/>
-        </w:rPr>
-        <w:t xml:space="preserve">, empresa agroindustrial ubicada en Antioquia, ha estructurado un Sistema de Información de Mercadeo (SIM) para apoyar su proceso de exportación de aguacate </w:t>
-      </w:r>
-      <w:r>
-        <w:rPr>
-          <w:rStyle w:val="Extranjerismo"/>
-        </w:rPr>
-        <w:t>Hass</w:t>
+      <w:r>
+        <w:rPr>
+          <w:lang w:val="es-419" w:eastAsia="es-CO"/>
+        </w:rPr>
+        <w:t>Agroverde Export, empresa agroindustrial ubicada en Antioquia, ha estructurado un Sistema de Información de Mercadeo (SIM) para apoyar su proceso de exportación de aguacate</w:t>
+      </w:r>
+      <w:r>
+        <w:rPr>
+          <w:lang w:val="es-419" w:eastAsia="es-CO"/>
+        </w:rPr>
+        <w:t xml:space="preserve"> Hass</w:t>
       </w:r>
       <w:r>
         <w:rPr>
@@ -9521,13 +9527,13 @@
         <w:rPr>
           <w:lang w:val="es-419" w:eastAsia="es-CO"/>
         </w:rPr>
-        <w:t xml:space="preserve">Producto: aguacate </w:t>
-      </w:r>
-      <w:r>
-        <w:rPr>
-          <w:rStyle w:val="Extranjerismo"/>
-        </w:rPr>
-        <w:t>Hass</w:t>
+        <w:t>Producto: aguacate</w:t>
+      </w:r>
+      <w:r>
+        <w:rPr>
+          <w:lang w:val="es-419" w:eastAsia="es-CO"/>
+        </w:rPr>
+        <w:t xml:space="preserve"> Hass</w:t>
       </w:r>
       <w:r>
         <w:rPr>
@@ -9594,36 +9600,8 @@
           <w:bCs/>
           <w:lang w:val="es-419" w:eastAsia="es-CO"/>
         </w:rPr>
-        <w:t xml:space="preserve">Estructura del SIM en </w:t>
-      </w:r>
-      <w:proofErr w:type="spellStart"/>
-      <w:r>
-        <w:rPr>
-          <w:b/>
-          <w:bCs/>
-          <w:lang w:val="es-419" w:eastAsia="es-CO"/>
-        </w:rPr>
-        <w:t>Agroverde</w:t>
-      </w:r>
-      <w:proofErr w:type="spellEnd"/>
-      <w:r>
-        <w:rPr>
-          <w:b/>
-          <w:bCs/>
-          <w:lang w:val="es-419" w:eastAsia="es-CO"/>
-        </w:rPr>
-        <w:t xml:space="preserve"> </w:t>
-      </w:r>
-      <w:proofErr w:type="spellStart"/>
-      <w:r>
-        <w:rPr>
-          <w:b/>
-          <w:bCs/>
-          <w:lang w:val="es-419" w:eastAsia="es-CO"/>
-        </w:rPr>
-        <w:t>Export</w:t>
-      </w:r>
-      <w:proofErr w:type="spellEnd"/>
+        <w:t>Estructura del SIM en Agroverde Export</w:t>
+      </w:r>
     </w:p>
     <w:p>
       <w:pPr>
@@ -9737,14 +9715,12 @@
         </w:rPr>
         <w:t xml:space="preserve"> en </w:t>
       </w:r>
-      <w:proofErr w:type="spellStart"/>
-      <w:r>
-        <w:rPr>
-          <w:lang w:val="es-419" w:eastAsia="es-CO"/>
+      <w:r>
+        <w:rPr>
+          <w:rStyle w:val="Extranjerismo"/>
         </w:rPr>
         <w:t>Power</w:t>
       </w:r>
-      <w:proofErr w:type="spellEnd"/>
       <w:r>
         <w:rPr>
           <w:lang w:val="es-419" w:eastAsia="es-CO"/>
@@ -9949,7 +9925,14 @@
           <w:rFonts w:eastAsia="Times New Roman"/>
           <w:szCs w:val="28"/>
         </w:rPr>
-        <w:t>Charlas que venden” Episodio: “SIM</w:t>
+        <w:t>ch</w:t>
+      </w:r>
+      <w:r>
+        <w:rPr>
+          <w:rFonts w:eastAsia="Times New Roman"/>
+          <w:szCs w:val="28"/>
+        </w:rPr>
+        <w:t>arlas que venden” Episodio: “SIM</w:t>
       </w:r>
       <w:r>
         <w:rPr>
@@ -10008,6 +9991,13 @@
               </w:rPr>
               <w:t xml:space="preserve"> </w:t>
             </w:r>
+            <w:r>
+              <w:rPr>
+                <w:bCs/>
+                <w:lang w:val="es-419"/>
+              </w:rPr>
+              <w:t>charlas que venden</w:t>
+            </w:r>
           </w:p>
         </w:tc>
       </w:tr>
@@ -10057,14 +10047,26 @@
               <w:rPr>
                 <w:lang w:val="es-419"/>
               </w:rPr>
-              <w:t xml:space="preserve">¡Buenos días, buenas tardes y buenas compras mi genteeee! Aquí Kevin, su aprendiz estrella —aunque todavía no me han dado el Grammy del mercadeo—. Hoy </w:t>
+              <w:t>¡Buenos días, buenas tardes y buenas compras mi genteeee! Aquí Kevin, su aprendiz estrella</w:t>
+            </w:r>
+            <w:r>
+              <w:rPr>
+                <w:lang w:val="es-419"/>
+              </w:rPr>
+              <w:t xml:space="preserve">, </w:t>
+            </w:r>
+            <w:r>
+              <w:rPr>
+                <w:lang w:val="es-419"/>
+              </w:rPr>
+              <w:t xml:space="preserve">aunque todavía no me han dado el Grammy del mercadeo. Hoy voy </w:t>
             </w:r>
             <w:r>
               <w:rPr>
                 <w:lang w:val="es-419"/>
               </w:rPr>
               <w:lastRenderedPageBreak/>
-              <w:t>voy a sacarle chispas al SIM… ¡A toda marcha, mi querido instructor! Aquí está su copiloto de este viaje de conocimientooooo (hace ruido de carro acelerando)</w:t>
+              <w:t>a sacarle chispas al SIM… ¡A toda marcha, mi querido instructor! Aquí está su copiloto de este viaje de conocimientooooo (hace ruido de carro acelerando)</w:t>
             </w:r>
             <w:r>
               <w:rPr>
@@ -10263,28 +10265,18 @@
               </w:rPr>
               <w:t xml:space="preserve">Investigación de mercados: encuestas, </w:t>
             </w:r>
-            <w:proofErr w:type="spellStart"/>
-            <w:r>
-              <w:rPr>
-                <w:lang w:val="es-419"/>
-              </w:rPr>
-              <w:t>focus</w:t>
-            </w:r>
-            <w:proofErr w:type="spellEnd"/>
-            <w:r>
-              <w:rPr>
-                <w:lang w:val="es-419"/>
-              </w:rPr>
-              <w:t xml:space="preserve"> </w:t>
-            </w:r>
-            <w:proofErr w:type="spellStart"/>
-            <w:r>
-              <w:rPr>
-                <w:lang w:val="es-419"/>
+            <w:r>
+              <w:rPr>
+                <w:rStyle w:val="Extranjerismo"/>
+              </w:rPr>
+              <w:t xml:space="preserve">focus </w:t>
+            </w:r>
+            <w:r>
+              <w:rPr>
+                <w:rStyle w:val="Extranjerismo"/>
               </w:rPr>
               <w:t>group</w:t>
             </w:r>
-            <w:proofErr w:type="spellEnd"/>
             <w:r>
               <w:rPr>
                 <w:lang w:val="es-419"/>
@@ -10713,7 +10705,7 @@
       <w:pPr>
         <w:pStyle w:val="Ttulo1"/>
       </w:pPr>
-      <w:bookmarkStart w:id="20" w:name="_Toc203038469"/>
+      <w:bookmarkStart w:id="20" w:name="_Toc204344294"/>
       <w:r>
         <w:lastRenderedPageBreak/>
         <w:t>Análisis situacional</w:t>
@@ -10737,7 +10729,7 @@
       <w:pPr>
         <w:pStyle w:val="Ttulo2"/>
       </w:pPr>
-      <w:bookmarkStart w:id="21" w:name="_Toc203038470"/>
+      <w:bookmarkStart w:id="21" w:name="_Toc204344295"/>
       <w:r>
         <w:t>Concepto</w:t>
       </w:r>
@@ -10776,7 +10768,7 @@
       <w:pPr>
         <w:pStyle w:val="Ttulo2"/>
       </w:pPr>
-      <w:bookmarkStart w:id="22" w:name="_Toc203038471"/>
+      <w:bookmarkStart w:id="22" w:name="_Toc204344296"/>
       <w:r>
         <w:lastRenderedPageBreak/>
         <w:t>Variables</w:t>
@@ -10892,7 +10884,7 @@
       <w:pPr>
         <w:pStyle w:val="Ttulo2"/>
       </w:pPr>
-      <w:bookmarkStart w:id="23" w:name="_Toc203038472"/>
+      <w:bookmarkStart w:id="23" w:name="_Toc204344297"/>
       <w:r>
         <w:lastRenderedPageBreak/>
         <w:t>Metodología</w:t>
@@ -11052,7 +11044,7 @@
       <w:pPr>
         <w:pStyle w:val="Ttulo1"/>
       </w:pPr>
-      <w:bookmarkStart w:id="24" w:name="_Toc203038473"/>
+      <w:bookmarkStart w:id="24" w:name="_Toc204344298"/>
       <w:r>
         <w:lastRenderedPageBreak/>
         <w:t>Herramientas diagnósticas</w:t>
@@ -11082,7 +11074,7 @@
       <w:pPr>
         <w:pStyle w:val="Ttulo2"/>
       </w:pPr>
-      <w:bookmarkStart w:id="25" w:name="_Toc203038474"/>
+      <w:bookmarkStart w:id="25" w:name="_Toc204344299"/>
       <w:r>
         <w:t>Concepto</w:t>
       </w:r>
@@ -11118,7 +11110,7 @@
       <w:pPr>
         <w:pStyle w:val="Ttulo2"/>
       </w:pPr>
-      <w:bookmarkStart w:id="26" w:name="_Toc203038475"/>
+      <w:bookmarkStart w:id="26" w:name="_Toc204344300"/>
       <w:r>
         <w:lastRenderedPageBreak/>
         <w:t>Tipos</w:t>
@@ -11254,7 +11246,7 @@
       <w:pPr>
         <w:pStyle w:val="Ttulo2"/>
       </w:pPr>
-      <w:bookmarkStart w:id="27" w:name="_Toc203038476"/>
+      <w:bookmarkStart w:id="27" w:name="_Toc204344301"/>
       <w:r>
         <w:t>Matrices</w:t>
       </w:r>
@@ -11333,6 +11325,7 @@
           <w:p>
             <w:pPr>
               <w:pStyle w:val="TextoTablas"/>
+              <w:jc w:val="center"/>
               <w:rPr>
                 <w:rFonts w:asciiTheme="minorHAnsi" w:hAnsiTheme="minorHAnsi" w:cs="Arial"/>
                 <w:bCs/>
@@ -11358,6 +11351,7 @@
           <w:p>
             <w:pPr>
               <w:pStyle w:val="TextoTablas"/>
+              <w:jc w:val="center"/>
               <w:rPr>
                 <w:rFonts w:asciiTheme="minorHAnsi" w:hAnsiTheme="minorHAnsi" w:cs="Arial"/>
                 <w:bCs/>
@@ -11692,7 +11686,7 @@
         <w:rPr>
           <w:lang w:val="es-419" w:eastAsia="es-CO"/>
         </w:rPr>
-        <w:t>PESTEL Postobón y su internacionalización en América Latina.</w:t>
+        <w:t>PESTEL Postobón y su internacionalización en América Latina</w:t>
       </w:r>
     </w:p>
     <w:tbl>
@@ -11721,6 +11715,7 @@
           <w:p>
             <w:pPr>
               <w:pStyle w:val="TextoTablas"/>
+              <w:jc w:val="center"/>
               <w:rPr>
                 <w:rFonts w:asciiTheme="minorHAnsi" w:hAnsiTheme="minorHAnsi" w:cs="Arial"/>
                 <w:bCs/>
@@ -11746,6 +11741,7 @@
           <w:p>
             <w:pPr>
               <w:pStyle w:val="TextoTablas"/>
+              <w:jc w:val="center"/>
               <w:rPr>
                 <w:rFonts w:asciiTheme="minorHAnsi" w:hAnsiTheme="minorHAnsi" w:cs="Arial"/>
                 <w:bCs/>
@@ -12133,7 +12129,7 @@
         <w:rPr>
           <w:lang w:val="es-419" w:eastAsia="es-CO"/>
         </w:rPr>
-        <w:t xml:space="preserve"> Totto y su expansión en el mercado europeo.</w:t>
+        <w:t xml:space="preserve"> Totto y su expansión en el mercado europeo</w:t>
       </w:r>
     </w:p>
     <w:tbl>
@@ -12164,6 +12160,7 @@
           <w:p>
             <w:pPr>
               <w:pStyle w:val="TextoTablas"/>
+              <w:jc w:val="center"/>
               <w:rPr>
                 <w:rFonts w:asciiTheme="minorHAnsi" w:hAnsiTheme="minorHAnsi" w:cs="Arial"/>
                 <w:bCs/>
@@ -12189,6 +12186,7 @@
           <w:p>
             <w:pPr>
               <w:pStyle w:val="TextoTablas"/>
+              <w:jc w:val="center"/>
               <w:rPr>
                 <w:rFonts w:asciiTheme="minorHAnsi" w:hAnsiTheme="minorHAnsi" w:cs="Arial"/>
                 <w:bCs/>
@@ -12214,6 +12212,7 @@
           <w:p>
             <w:pPr>
               <w:pStyle w:val="TextoTablas"/>
+              <w:jc w:val="center"/>
               <w:rPr>
                 <w:rFonts w:asciiTheme="minorHAnsi" w:hAnsiTheme="minorHAnsi" w:cs="Arial"/>
                 <w:bCs/>
@@ -12265,6 +12264,7 @@
           <w:p>
             <w:pPr>
               <w:pStyle w:val="TextoTablas"/>
+              <w:jc w:val="center"/>
               <w:rPr>
                 <w:rFonts w:asciiTheme="minorHAnsi" w:hAnsiTheme="minorHAnsi" w:cs="Arial"/>
                 <w:bCs/>
@@ -12692,7 +12692,7 @@
           <w:lang w:val="es-419" w:eastAsia="es-CO"/>
         </w:rPr>
         <w:lastRenderedPageBreak/>
-        <w:t>Porter Juan Valdez y la expansión del café colombiano.</w:t>
+        <w:t>Porter Juan Valdez y la expansión del café colombiano</w:t>
       </w:r>
     </w:p>
     <w:tbl>
@@ -12721,6 +12721,7 @@
           <w:p>
             <w:pPr>
               <w:pStyle w:val="TextoTablas"/>
+              <w:jc w:val="center"/>
               <w:rPr>
                 <w:rFonts w:asciiTheme="minorHAnsi" w:hAnsiTheme="minorHAnsi" w:cs="Arial"/>
                 <w:bCs/>
@@ -12746,6 +12747,7 @@
           <w:p>
             <w:pPr>
               <w:pStyle w:val="TextoTablas"/>
+              <w:jc w:val="center"/>
               <w:rPr>
                 <w:rFonts w:asciiTheme="minorHAnsi" w:hAnsiTheme="minorHAnsi" w:cs="Arial"/>
                 <w:bCs/>
@@ -13189,7 +13191,7 @@
       <w:pPr>
         <w:pStyle w:val="Titulosgenerales"/>
       </w:pPr>
-      <w:bookmarkStart w:id="28" w:name="_Toc203038477"/>
+      <w:bookmarkStart w:id="28" w:name="_Toc204344302"/>
       <w:r>
         <w:lastRenderedPageBreak/>
         <w:t>Síntesis</w:t>
@@ -13287,7 +13289,7 @@
       <w:pPr>
         <w:pStyle w:val="Titulosgenerales"/>
       </w:pPr>
-      <w:bookmarkStart w:id="29" w:name="_Toc203038478"/>
+      <w:bookmarkStart w:id="29" w:name="_Toc204344303"/>
       <w:r>
         <w:lastRenderedPageBreak/>
         <w:t>Glosario</w:t>
@@ -14001,7 +14003,7 @@
       <w:pPr>
         <w:pStyle w:val="Titulosgenerales"/>
       </w:pPr>
-      <w:bookmarkStart w:id="30" w:name="_Toc203038479"/>
+      <w:bookmarkStart w:id="30" w:name="_Toc204344304"/>
       <w:r>
         <w:lastRenderedPageBreak/>
         <w:t>Material complementario</w:t>
@@ -14157,7 +14159,61 @@
                 <w:sz w:val="28"/>
                 <w:szCs w:val="28"/>
               </w:rPr>
-              <w:t>Ecosistema de Recursos Educativos Digitales SENA. (2020). Introducción al Mercadeo Internacional [Video]. YouTube.</w:t>
+              <w:t xml:space="preserve">Ecosistema de Recursos Educativos Digitales SENA. (2020). </w:t>
+            </w:r>
+            <w:proofErr w:type="spellStart"/>
+            <w:r>
+              <w:rPr>
+                <w:rStyle w:val="Extranjerismo"/>
+                <w:sz w:val="28"/>
+                <w:szCs w:val="28"/>
+              </w:rPr>
+              <w:t>Introducción</w:t>
+            </w:r>
+            <w:proofErr w:type="spellEnd"/>
+            <w:r>
+              <w:rPr>
+                <w:rStyle w:val="Extranjerismo"/>
+                <w:sz w:val="28"/>
+                <w:szCs w:val="28"/>
+              </w:rPr>
+              <w:t xml:space="preserve"> al </w:t>
+            </w:r>
+            <w:proofErr w:type="spellStart"/>
+            <w:r>
+              <w:rPr>
+                <w:rStyle w:val="Extranjerismo"/>
+                <w:sz w:val="28"/>
+                <w:szCs w:val="28"/>
+              </w:rPr>
+              <w:t>Mercadeo</w:t>
+            </w:r>
+            <w:proofErr w:type="spellEnd"/>
+            <w:r>
+              <w:rPr>
+                <w:rStyle w:val="Extranjerismo"/>
+                <w:sz w:val="28"/>
+                <w:szCs w:val="28"/>
+              </w:rPr>
+              <w:t xml:space="preserve"> </w:t>
+            </w:r>
+            <w:proofErr w:type="spellStart"/>
+            <w:r>
+              <w:rPr>
+                <w:rStyle w:val="Extranjerismo"/>
+                <w:sz w:val="28"/>
+                <w:szCs w:val="28"/>
+              </w:rPr>
+              <w:t>Internacional</w:t>
+            </w:r>
+            <w:proofErr w:type="spellEnd"/>
+            <w:r>
+              <w:rPr>
+                <w:rStyle w:val="Extranjerismo"/>
+                <w:sz w:val="28"/>
+                <w:szCs w:val="28"/>
+              </w:rPr>
+              <w:t xml:space="preserve"> [Video]. YouTube.</w:t>
             </w:r>
           </w:p>
         </w:tc>
@@ -14255,7 +14311,79 @@
                 <w:sz w:val="28"/>
                 <w:szCs w:val="28"/>
               </w:rPr>
-              <w:t>Cuenta Conmigo. (2020). Análisis PESTEL. Fácil, rápido y sencillo [Video]. YouTube.</w:t>
+              <w:t xml:space="preserve">Cuenta Conmigo. (2020). </w:t>
+            </w:r>
+            <w:proofErr w:type="spellStart"/>
+            <w:r>
+              <w:rPr>
+                <w:rStyle w:val="Extranjerismo"/>
+                <w:sz w:val="28"/>
+                <w:szCs w:val="28"/>
+              </w:rPr>
+              <w:t>Análisis</w:t>
+            </w:r>
+            <w:proofErr w:type="spellEnd"/>
+            <w:r>
+              <w:rPr>
+                <w:rStyle w:val="Extranjerismo"/>
+                <w:sz w:val="28"/>
+                <w:szCs w:val="28"/>
+              </w:rPr>
+              <w:t xml:space="preserve"> PESTEL. </w:t>
+            </w:r>
+            <w:proofErr w:type="spellStart"/>
+            <w:r>
+              <w:rPr>
+                <w:rStyle w:val="Extranjerismo"/>
+                <w:sz w:val="28"/>
+                <w:szCs w:val="28"/>
+              </w:rPr>
+              <w:t>Fácil</w:t>
+            </w:r>
+            <w:proofErr w:type="spellEnd"/>
+            <w:r>
+              <w:rPr>
+                <w:rStyle w:val="Extranjerismo"/>
+                <w:sz w:val="28"/>
+                <w:szCs w:val="28"/>
+              </w:rPr>
+              <w:t xml:space="preserve">, </w:t>
+            </w:r>
+            <w:proofErr w:type="spellStart"/>
+            <w:r>
+              <w:rPr>
+                <w:rStyle w:val="Extranjerismo"/>
+                <w:sz w:val="28"/>
+                <w:szCs w:val="28"/>
+              </w:rPr>
+              <w:t>rápido</w:t>
+            </w:r>
+            <w:proofErr w:type="spellEnd"/>
+            <w:r>
+              <w:rPr>
+                <w:rStyle w:val="Extranjerismo"/>
+                <w:sz w:val="28"/>
+                <w:szCs w:val="28"/>
+              </w:rPr>
+              <w:t xml:space="preserve"> y </w:t>
+            </w:r>
+            <w:proofErr w:type="spellStart"/>
+            <w:r>
+              <w:rPr>
+                <w:rStyle w:val="Extranjerismo"/>
+                <w:sz w:val="28"/>
+                <w:szCs w:val="28"/>
+              </w:rPr>
+              <w:t>sencillo</w:t>
+            </w:r>
+            <w:proofErr w:type="spellEnd"/>
+            <w:r>
+              <w:rPr>
+                <w:rStyle w:val="Extranjerismo"/>
+                <w:sz w:val="28"/>
+                <w:szCs w:val="28"/>
+              </w:rPr>
+              <w:t xml:space="preserve"> [Video]. YouTube.</w:t>
             </w:r>
           </w:p>
         </w:tc>
@@ -14366,14 +14494,79 @@
                 <w:sz w:val="28"/>
                 <w:szCs w:val="28"/>
               </w:rPr>
-              <w:t>Benchmarking</w:t>
-            </w:r>
-            <w:r>
-              <w:rPr>
+              <w:t xml:space="preserve">Benchmarking: </w:t>
+            </w:r>
+            <w:proofErr w:type="spellStart"/>
+            <w:r>
+              <w:rPr>
+                <w:rStyle w:val="Extranjerismo"/>
                 <w:sz w:val="28"/>
                 <w:szCs w:val="28"/>
               </w:rPr>
-              <w:t>: qué es, cómo funciona, utilidad [Video]. YouTube.</w:t>
+              <w:t>qué</w:t>
+            </w:r>
+            <w:proofErr w:type="spellEnd"/>
+            <w:r>
+              <w:rPr>
+                <w:rStyle w:val="Extranjerismo"/>
+                <w:sz w:val="28"/>
+                <w:szCs w:val="28"/>
+              </w:rPr>
+              <w:t xml:space="preserve"> es, </w:t>
+            </w:r>
+            <w:proofErr w:type="spellStart"/>
+            <w:r>
+              <w:rPr>
+                <w:rStyle w:val="Extranjerismo"/>
+                <w:sz w:val="28"/>
+                <w:szCs w:val="28"/>
+              </w:rPr>
+              <w:t>cómo</w:t>
+            </w:r>
+            <w:proofErr w:type="spellEnd"/>
+            <w:r>
+              <w:rPr>
+                <w:rStyle w:val="Extranjerismo"/>
+                <w:sz w:val="28"/>
+                <w:szCs w:val="28"/>
+              </w:rPr>
+              <w:t xml:space="preserve"> </w:t>
+            </w:r>
+            <w:proofErr w:type="spellStart"/>
+            <w:r>
+              <w:rPr>
+                <w:rStyle w:val="Extranjerismo"/>
+                <w:sz w:val="28"/>
+                <w:szCs w:val="28"/>
+              </w:rPr>
+              <w:t>funciona</w:t>
+            </w:r>
+            <w:proofErr w:type="spellEnd"/>
+            <w:r>
+              <w:rPr>
+                <w:rStyle w:val="Extranjerismo"/>
+                <w:sz w:val="28"/>
+                <w:szCs w:val="28"/>
+              </w:rPr>
+              <w:t xml:space="preserve">, </w:t>
+            </w:r>
+            <w:proofErr w:type="spellStart"/>
+            <w:r>
+              <w:rPr>
+                <w:rStyle w:val="Extranjerismo"/>
+                <w:sz w:val="28"/>
+                <w:szCs w:val="28"/>
+              </w:rPr>
+              <w:t>utilidad</w:t>
+            </w:r>
+            <w:proofErr w:type="spellEnd"/>
+            <w:r>
+              <w:rPr>
+                <w:rStyle w:val="Extranjerismo"/>
+                <w:sz w:val="28"/>
+                <w:szCs w:val="28"/>
+              </w:rPr>
+              <w:t xml:space="preserve"> [Video]. YouTube.</w:t>
             </w:r>
           </w:p>
         </w:tc>
@@ -14473,7 +14666,79 @@
                 <w:sz w:val="28"/>
                 <w:szCs w:val="28"/>
               </w:rPr>
-              <w:t>Ecosistema de Recursos Educativos Digitales SENA. (2022). Estrategia de diagnóstico y análisis empresarial. (2022). [Video]. YouTube.</w:t>
+              <w:t xml:space="preserve">Ecosistema de Recursos Educativos Digitales SENA. (2022). </w:t>
+            </w:r>
+            <w:proofErr w:type="spellStart"/>
+            <w:r>
+              <w:rPr>
+                <w:rStyle w:val="Extranjerismo"/>
+                <w:sz w:val="28"/>
+                <w:szCs w:val="28"/>
+              </w:rPr>
+              <w:t>Estrategia</w:t>
+            </w:r>
+            <w:proofErr w:type="spellEnd"/>
+            <w:r>
+              <w:rPr>
+                <w:rStyle w:val="Extranjerismo"/>
+                <w:sz w:val="28"/>
+                <w:szCs w:val="28"/>
+              </w:rPr>
+              <w:t xml:space="preserve"> de </w:t>
+            </w:r>
+            <w:proofErr w:type="spellStart"/>
+            <w:r>
+              <w:rPr>
+                <w:rStyle w:val="Extranjerismo"/>
+                <w:sz w:val="28"/>
+                <w:szCs w:val="28"/>
+              </w:rPr>
+              <w:t>diagnóstico</w:t>
+            </w:r>
+            <w:proofErr w:type="spellEnd"/>
+            <w:r>
+              <w:rPr>
+                <w:rStyle w:val="Extranjerismo"/>
+                <w:sz w:val="28"/>
+                <w:szCs w:val="28"/>
+              </w:rPr>
+              <w:t xml:space="preserve"> y </w:t>
+            </w:r>
+            <w:proofErr w:type="spellStart"/>
+            <w:r>
+              <w:rPr>
+                <w:rStyle w:val="Extranjerismo"/>
+                <w:sz w:val="28"/>
+                <w:szCs w:val="28"/>
+              </w:rPr>
+              <w:t>análisis</w:t>
+            </w:r>
+            <w:proofErr w:type="spellEnd"/>
+            <w:r>
+              <w:rPr>
+                <w:rStyle w:val="Extranjerismo"/>
+                <w:sz w:val="28"/>
+                <w:szCs w:val="28"/>
+              </w:rPr>
+              <w:t xml:space="preserve"> </w:t>
+            </w:r>
+            <w:proofErr w:type="spellStart"/>
+            <w:r>
+              <w:rPr>
+                <w:rStyle w:val="Extranjerismo"/>
+                <w:sz w:val="28"/>
+                <w:szCs w:val="28"/>
+              </w:rPr>
+              <w:t>empresarial</w:t>
+            </w:r>
+            <w:proofErr w:type="spellEnd"/>
+            <w:r>
+              <w:rPr>
+                <w:rStyle w:val="Extranjerismo"/>
+                <w:sz w:val="28"/>
+                <w:szCs w:val="28"/>
+              </w:rPr>
+              <w:t>. (2022). [Video]. YouTube.</w:t>
             </w:r>
           </w:p>
         </w:tc>
@@ -14576,7 +14841,25 @@
                 <w:sz w:val="28"/>
                 <w:szCs w:val="28"/>
               </w:rPr>
-              <w:t>Ecosistema de Recursos Educativos Digitales SENA. (2021). Matriz DOFA [Video]. YouTube.</w:t>
+              <w:t xml:space="preserve">Ecosistema de Recursos Educativos Digitales SENA. (2021). </w:t>
+            </w:r>
+            <w:proofErr w:type="spellStart"/>
+            <w:r>
+              <w:rPr>
+                <w:rStyle w:val="Extranjerismo"/>
+                <w:sz w:val="28"/>
+                <w:szCs w:val="28"/>
+              </w:rPr>
+              <w:t>Matriz</w:t>
+            </w:r>
+            <w:proofErr w:type="spellEnd"/>
+            <w:r>
+              <w:rPr>
+                <w:rStyle w:val="Extranjerismo"/>
+                <w:sz w:val="28"/>
+                <w:szCs w:val="28"/>
+              </w:rPr>
+              <w:t xml:space="preserve"> DOFA [Video]. YouTube.</w:t>
             </w:r>
           </w:p>
         </w:tc>
@@ -14650,7 +14933,7 @@
       <w:pPr>
         <w:pStyle w:val="Titulosgenerales"/>
       </w:pPr>
-      <w:bookmarkStart w:id="31" w:name="_Toc203038480"/>
+      <w:bookmarkStart w:id="31" w:name="_Toc204344305"/>
       <w:r>
         <w:lastRenderedPageBreak/>
         <w:t>Referencias bibliográficas</w:t>
@@ -15386,7 +15669,7 @@
       <w:pPr>
         <w:pStyle w:val="Titulosgenerales"/>
       </w:pPr>
-      <w:bookmarkStart w:id="32" w:name="_Toc203038481"/>
+      <w:bookmarkStart w:id="32" w:name="_Toc204344306"/>
       <w:r>
         <w:lastRenderedPageBreak/>
         <w:t>C</w:t>
@@ -22835,6 +23118,26 @@
 </file>
 
 <file path=customXml/item2.xml><?xml version="1.0" encoding="utf-8"?>
+<p:properties xmlns:p="http://schemas.microsoft.com/office/2006/metadata/properties" xmlns:xsi="http://www.w3.org/2001/XMLSchema-instance" xmlns:pc="http://schemas.microsoft.com/office/infopath/2007/PartnerControls">
+  <documentManagement>
+    <TaxCatchAll xmlns="cb45339b-ced9-4d0d-8f64-77573914d53b"/>
+    <lcf76f155ced4ddcb4097134ff3c332f xmlns="43a3ca16-9c26-4813-b83f-4aec9927b43f">
+      <Terms xmlns="http://schemas.microsoft.com/office/infopath/2007/PartnerControls"/>
+    </lcf76f155ced4ddcb4097134ff3c332f>
+  </documentManagement>
+</p:properties>
+</file>
+
+<file path=customXml/item3.xml><?xml version="1.0" encoding="utf-8"?>
+<?mso-contentType ?>
+<FormTemplates xmlns="http://schemas.microsoft.com/sharepoint/v3/contenttype/forms">
+  <Display>DocumentLibraryForm</Display>
+  <Edit>DocumentLibraryForm</Edit>
+  <New>DocumentLibraryForm</New>
+</FormTemplates>
+</file>
+
+<file path=customXml/item4.xml><?xml version="1.0" encoding="utf-8"?>
 <ct:contentTypeSchema xmlns:ct="http://schemas.microsoft.com/office/2006/metadata/contentType" xmlns:ma="http://schemas.microsoft.com/office/2006/metadata/properties/metaAttributes" ct:_="" ma:_="" ma:contentTypeName="Documento" ma:contentTypeID="0x01010049282E1EDBE9234EA9E6D38F720E265F" ma:contentTypeVersion="15" ma:contentTypeDescription="Crear nuevo documento." ma:contentTypeScope="" ma:versionID="b31c7aa9eaf043a08b87120b3c4916e3">
   <xsd:schema xmlns:xsd="http://www.w3.org/2001/XMLSchema" xmlns:xs="http://www.w3.org/2001/XMLSchema" xmlns:p="http://schemas.microsoft.com/office/2006/metadata/properties" xmlns:ns2="cb45339b-ced9-4d0d-8f64-77573914d53b" xmlns:ns3="43a3ca16-9c26-4813-b83f-4aec9927b43f" targetNamespace="http://schemas.microsoft.com/office/2006/metadata/properties" ma:root="true" ma:fieldsID="3533d065b04d75c457075bc55f1f5315" ns2:_="" ns3:_="">
     <xsd:import namespace="cb45339b-ced9-4d0d-8f64-77573914d53b"/>
@@ -23069,26 +23372,6 @@
 </ct:contentTypeSchema>
 </file>
 
-<file path=customXml/item3.xml><?xml version="1.0" encoding="utf-8"?>
-<?mso-contentType ?>
-<FormTemplates xmlns="http://schemas.microsoft.com/sharepoint/v3/contenttype/forms">
-  <Display>DocumentLibraryForm</Display>
-  <Edit>DocumentLibraryForm</Edit>
-  <New>DocumentLibraryForm</New>
-</FormTemplates>
-</file>
-
-<file path=customXml/item4.xml><?xml version="1.0" encoding="utf-8"?>
-<p:properties xmlns:p="http://schemas.microsoft.com/office/2006/metadata/properties" xmlns:xsi="http://www.w3.org/2001/XMLSchema-instance" xmlns:pc="http://schemas.microsoft.com/office/infopath/2007/PartnerControls">
-  <documentManagement>
-    <TaxCatchAll xmlns="cb45339b-ced9-4d0d-8f64-77573914d53b"/>
-    <lcf76f155ced4ddcb4097134ff3c332f xmlns="43a3ca16-9c26-4813-b83f-4aec9927b43f">
-      <Terms xmlns="http://schemas.microsoft.com/office/infopath/2007/PartnerControls"/>
-    </lcf76f155ced4ddcb4097134ff3c332f>
-  </documentManagement>
-</p:properties>
-</file>
-
 <file path=customXml/itemProps1.xml><?xml version="1.0" encoding="utf-8"?>
 <ds:datastoreItem xmlns:ds="http://schemas.openxmlformats.org/officeDocument/2006/customXml" ds:itemID="{E8AB44A3-7C62-4BD2-82ED-8ABC209970FA}">
   <ds:schemaRefs>
@@ -23098,6 +23381,25 @@
 </file>
 
 <file path=customXml/itemProps2.xml><?xml version="1.0" encoding="utf-8"?>
+<ds:datastoreItem xmlns:ds="http://schemas.openxmlformats.org/officeDocument/2006/customXml" ds:itemID="{1145D752-ACC1-45E1-AB53-0C756F67FC7F}">
+  <ds:schemaRefs>
+    <ds:schemaRef ds:uri="http://schemas.microsoft.com/office/2006/metadata/properties"/>
+    <ds:schemaRef ds:uri="http://schemas.microsoft.com/office/infopath/2007/PartnerControls"/>
+    <ds:schemaRef ds:uri="cb45339b-ced9-4d0d-8f64-77573914d53b"/>
+    <ds:schemaRef ds:uri="43a3ca16-9c26-4813-b83f-4aec9927b43f"/>
+  </ds:schemaRefs>
+</ds:datastoreItem>
+</file>
+
+<file path=customXml/itemProps3.xml><?xml version="1.0" encoding="utf-8"?>
+<ds:datastoreItem xmlns:ds="http://schemas.openxmlformats.org/officeDocument/2006/customXml" ds:itemID="{81CBDEC1-3B00-44ED-AD36-0268077980BA}">
+  <ds:schemaRefs>
+    <ds:schemaRef ds:uri="http://schemas.microsoft.com/sharepoint/v3/contenttype/forms"/>
+  </ds:schemaRefs>
+</ds:datastoreItem>
+</file>
+
+<file path=customXml/itemProps4.xml><?xml version="1.0" encoding="utf-8"?>
 <ds:datastoreItem xmlns:ds="http://schemas.openxmlformats.org/officeDocument/2006/customXml" ds:itemID="{DF43E046-DB0C-42D1-8C73-AE38B52F1ED7}">
   <ds:schemaRefs>
     <ds:schemaRef ds:uri="http://schemas.microsoft.com/office/2006/metadata/contentType"/>
@@ -23114,23 +23416,4 @@
     <ds:schemaRef ds:uri="http://schemas.microsoft.com/internal/obd"/>
   </ds:schemaRefs>
 </ds:datastoreItem>
-</file>
-
-<file path=customXml/itemProps3.xml><?xml version="1.0" encoding="utf-8"?>
-<ds:datastoreItem xmlns:ds="http://schemas.openxmlformats.org/officeDocument/2006/customXml" ds:itemID="{81CBDEC1-3B00-44ED-AD36-0268077980BA}">
-  <ds:schemaRefs>
-    <ds:schemaRef ds:uri="http://schemas.microsoft.com/sharepoint/v3/contenttype/forms"/>
-  </ds:schemaRefs>
-</ds:datastoreItem>
-</file>
-
-<file path=customXml/itemProps4.xml><?xml version="1.0" encoding="utf-8"?>
-<ds:datastoreItem xmlns:ds="http://schemas.openxmlformats.org/officeDocument/2006/customXml" ds:itemID="{1145D752-ACC1-45E1-AB53-0C756F67FC7F}">
-  <ds:schemaRefs>
-    <ds:schemaRef ds:uri="http://schemas.microsoft.com/office/2006/metadata/properties"/>
-    <ds:schemaRef ds:uri="http://schemas.microsoft.com/office/infopath/2007/PartnerControls"/>
-    <ds:schemaRef ds:uri="cb45339b-ced9-4d0d-8f64-77573914d53b"/>
-    <ds:schemaRef ds:uri="43a3ca16-9c26-4813-b83f-4aec9927b43f"/>
-  </ds:schemaRefs>
-</ds:datastoreItem>
 </file>
</xml_diff>

<commit_message>
Actualizado CFA y ajustada la palabra Hass
</commit_message>
<xml_diff>
--- a/fuentes/CFA1_12410020_DU.docx
+++ b/fuentes/CFA1_12410020_DU.docx
@@ -4847,6 +4847,12 @@
         </w:rPr>
         <w:t>”</w:t>
       </w:r>
+      <w:r>
+        <w:rPr>
+          <w:lang w:val="es-419" w:eastAsia="es-CO"/>
+        </w:rPr>
+        <w:t xml:space="preserve"> </w:t>
+      </w:r>
     </w:p>
     <w:tbl>
       <w:tblPr>
@@ -8525,10 +8531,10 @@
         <w:t xml:space="preserve">Sistema de información de mercadeo </w:t>
       </w:r>
       <w:r>
-        <w:t>–</w:t>
-      </w:r>
-      <w:r>
-        <w:t xml:space="preserve"> SIM</w:t>
+        <w:t xml:space="preserve">- </w:t>
+      </w:r>
+      <w:r>
+        <w:t>SIM</w:t>
       </w:r>
       <w:bookmarkEnd w:id="14"/>
     </w:p>
@@ -12692,7 +12698,7 @@
           <w:lang w:val="es-419" w:eastAsia="es-CO"/>
         </w:rPr>
         <w:lastRenderedPageBreak/>
-        <w:t>Porter Juan Valdez y la expansión del café colombiano</w:t>
+        <w:t>Juan Valdez y la expansión del café colombiano</w:t>
       </w:r>
     </w:p>
     <w:tbl>

</xml_diff>

<commit_message>
Ajustado CFA y agregada carpeta de anexos
</commit_message>
<xml_diff>
--- a/fuentes/CFA1_12410020_DU.docx
+++ b/fuentes/CFA1_12410020_DU.docx
@@ -85,7 +85,7 @@
               </wp:anchor>
             </w:drawing>
           </mc:Choice>
-          <mc:Fallback xmlns:w16sdtfl="http://schemas.microsoft.com/office/word/2024/wordml/sdtformatlock" xmlns:w16du="http://schemas.microsoft.com/office/word/2023/wordml/word16du" xmlns:oel="http://schemas.microsoft.com/office/2019/extlst">
+          <mc:Fallback xmlns:oel="http://schemas.microsoft.com/office/2019/extlst" xmlns:w16du="http://schemas.microsoft.com/office/word/2023/wordml/word16du" xmlns:w16sdtfl="http://schemas.microsoft.com/office/word/2024/wordml/sdtformatlock">
             <w:pict>
               <v:rect w14:anchorId="4E7873B1" id="Rectángulo 3" o:spid="_x0000_s1026" alt="&quot;&quot;" style="position:absolute;margin-left:-54pt;margin-top:31.65pt;width:613.85pt;height:204pt;z-index:-251655168;visibility:visible;mso-wrap-style:square;mso-height-percent:0;mso-wrap-distance-left:9pt;mso-wrap-distance-top:0;mso-wrap-distance-right:9pt;mso-wrap-distance-bottom:0;mso-position-horizontal:absolute;mso-position-horizontal-relative:text;mso-position-vertical:absolute;mso-position-vertical-relative:text;mso-height-percent:0;mso-height-relative:margin;v-text-anchor:middle" o:gfxdata="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" fillcolor="#00314d" stroked="f" strokeweight="1pt"/>
             </w:pict>
@@ -4853,6 +4853,12 @@
         </w:rPr>
         <w:t xml:space="preserve"> </w:t>
       </w:r>
+      <w:r>
+        <w:rPr>
+          <w:lang w:val="es-419" w:eastAsia="es-CO"/>
+        </w:rPr>
+        <w:t>este audio se encuentra disponible en la carpeta “Anexos”.</w:t>
+      </w:r>
     </w:p>
     <w:tbl>
       <w:tblPr>
@@ -10176,6 +10182,20 @@
           <w:szCs w:val="28"/>
         </w:rPr>
         <w:t>”</w:t>
+      </w:r>
+      <w:r>
+        <w:rPr>
+          <w:rFonts w:eastAsia="Times New Roman"/>
+          <w:szCs w:val="28"/>
+        </w:rPr>
+        <w:t xml:space="preserve"> </w:t>
+      </w:r>
+      <w:r>
+        <w:rPr>
+          <w:rFonts w:eastAsia="Times New Roman"/>
+          <w:szCs w:val="28"/>
+        </w:rPr>
+        <w:t>este audio se encuentra disponible en la carpeta “Anexos”.</w:t>
       </w:r>
     </w:p>
     <w:tbl>
@@ -23563,10 +23583,6 @@
 </file>
 
 <file path=customXml/item1.xml><?xml version="1.0" encoding="utf-8"?>
-<b:Sources xmlns:b="http://schemas.openxmlformats.org/officeDocument/2006/bibliography" xmlns="http://schemas.openxmlformats.org/officeDocument/2006/bibliography" SelectedStyle="\APASixthEditionOfficeOnline.xsl" StyleName="APA" Version="6"/>
-</file>
-
-<file path=customXml/item2.xml><?xml version="1.0" encoding="utf-8"?>
 <p:properties xmlns:p="http://schemas.microsoft.com/office/2006/metadata/properties" xmlns:xsi="http://www.w3.org/2001/XMLSchema-instance" xmlns:pc="http://schemas.microsoft.com/office/infopath/2007/PartnerControls">
   <documentManagement>
     <TaxCatchAll xmlns="cb45339b-ced9-4d0d-8f64-77573914d53b"/>
@@ -23577,16 +23593,11 @@
 </p:properties>
 </file>
 
-<file path=customXml/item3.xml><?xml version="1.0" encoding="utf-8"?>
-<?mso-contentType ?>
-<FormTemplates xmlns="http://schemas.microsoft.com/sharepoint/v3/contenttype/forms">
-  <Display>DocumentLibraryForm</Display>
-  <Edit>DocumentLibraryForm</Edit>
-  <New>DocumentLibraryForm</New>
-</FormTemplates>
+<file path=customXml/item2.xml><?xml version="1.0" encoding="utf-8"?>
+<b:Sources xmlns:b="http://schemas.openxmlformats.org/officeDocument/2006/bibliography" xmlns="http://schemas.openxmlformats.org/officeDocument/2006/bibliography" SelectedStyle="\APASixthEditionOfficeOnline.xsl" StyleName="APA" Version="6"/>
 </file>
 
-<file path=customXml/item4.xml><?xml version="1.0" encoding="utf-8"?>
+<file path=customXml/item3.xml><?xml version="1.0" encoding="utf-8"?>
 <ct:contentTypeSchema xmlns:ct="http://schemas.microsoft.com/office/2006/metadata/contentType" xmlns:ma="http://schemas.microsoft.com/office/2006/metadata/properties/metaAttributes" ct:_="" ma:_="" ma:contentTypeName="Documento" ma:contentTypeID="0x01010049282E1EDBE9234EA9E6D38F720E265F" ma:contentTypeVersion="15" ma:contentTypeDescription="Crear nuevo documento." ma:contentTypeScope="" ma:versionID="b31c7aa9eaf043a08b87120b3c4916e3">
   <xsd:schema xmlns:xsd="http://www.w3.org/2001/XMLSchema" xmlns:xs="http://www.w3.org/2001/XMLSchema" xmlns:p="http://schemas.microsoft.com/office/2006/metadata/properties" xmlns:ns2="cb45339b-ced9-4d0d-8f64-77573914d53b" xmlns:ns3="43a3ca16-9c26-4813-b83f-4aec9927b43f" targetNamespace="http://schemas.microsoft.com/office/2006/metadata/properties" ma:root="true" ma:fieldsID="3533d065b04d75c457075bc55f1f5315" ns2:_="" ns3:_="">
     <xsd:import namespace="cb45339b-ced9-4d0d-8f64-77573914d53b"/>
@@ -23821,15 +23832,16 @@
 </ct:contentTypeSchema>
 </file>
 
-<file path=customXml/itemProps1.xml><?xml version="1.0" encoding="utf-8"?>
-<ds:datastoreItem xmlns:ds="http://schemas.openxmlformats.org/officeDocument/2006/customXml" ds:itemID="{E8AB44A3-7C62-4BD2-82ED-8ABC209970FA}">
-  <ds:schemaRefs>
-    <ds:schemaRef ds:uri="http://schemas.openxmlformats.org/officeDocument/2006/bibliography"/>
-  </ds:schemaRefs>
-</ds:datastoreItem>
+<file path=customXml/item4.xml><?xml version="1.0" encoding="utf-8"?>
+<?mso-contentType ?>
+<FormTemplates xmlns="http://schemas.microsoft.com/sharepoint/v3/contenttype/forms">
+  <Display>DocumentLibraryForm</Display>
+  <Edit>DocumentLibraryForm</Edit>
+  <New>DocumentLibraryForm</New>
+</FormTemplates>
 </file>
 
-<file path=customXml/itemProps2.xml><?xml version="1.0" encoding="utf-8"?>
+<file path=customXml/itemProps1.xml><?xml version="1.0" encoding="utf-8"?>
 <ds:datastoreItem xmlns:ds="http://schemas.openxmlformats.org/officeDocument/2006/customXml" ds:itemID="{1145D752-ACC1-45E1-AB53-0C756F67FC7F}">
   <ds:schemaRefs>
     <ds:schemaRef ds:uri="http://schemas.microsoft.com/office/2006/metadata/properties"/>
@@ -23840,15 +23852,15 @@
 </ds:datastoreItem>
 </file>
 
-<file path=customXml/itemProps3.xml><?xml version="1.0" encoding="utf-8"?>
-<ds:datastoreItem xmlns:ds="http://schemas.openxmlformats.org/officeDocument/2006/customXml" ds:itemID="{81CBDEC1-3B00-44ED-AD36-0268077980BA}">
+<file path=customXml/itemProps2.xml><?xml version="1.0" encoding="utf-8"?>
+<ds:datastoreItem xmlns:ds="http://schemas.openxmlformats.org/officeDocument/2006/customXml" ds:itemID="{E8AB44A3-7C62-4BD2-82ED-8ABC209970FA}">
   <ds:schemaRefs>
-    <ds:schemaRef ds:uri="http://schemas.microsoft.com/sharepoint/v3/contenttype/forms"/>
+    <ds:schemaRef ds:uri="http://schemas.openxmlformats.org/officeDocument/2006/bibliography"/>
   </ds:schemaRefs>
 </ds:datastoreItem>
 </file>
 
-<file path=customXml/itemProps4.xml><?xml version="1.0" encoding="utf-8"?>
+<file path=customXml/itemProps3.xml><?xml version="1.0" encoding="utf-8"?>
 <ds:datastoreItem xmlns:ds="http://schemas.openxmlformats.org/officeDocument/2006/customXml" ds:itemID="{DF43E046-DB0C-42D1-8C73-AE38B52F1ED7}">
   <ds:schemaRefs>
     <ds:schemaRef ds:uri="http://schemas.microsoft.com/office/2006/metadata/contentType"/>
@@ -23865,4 +23877,12 @@
     <ds:schemaRef ds:uri="http://schemas.microsoft.com/internal/obd"/>
   </ds:schemaRefs>
 </ds:datastoreItem>
+</file>
+
+<file path=customXml/itemProps4.xml><?xml version="1.0" encoding="utf-8"?>
+<ds:datastoreItem xmlns:ds="http://schemas.openxmlformats.org/officeDocument/2006/customXml" ds:itemID="{81CBDEC1-3B00-44ED-AD36-0268077980BA}">
+  <ds:schemaRefs>
+    <ds:schemaRef ds:uri="http://schemas.microsoft.com/sharepoint/v3/contenttype/forms"/>
+  </ds:schemaRefs>
+</ds:datastoreItem>
 </file>
</xml_diff>